<commit_message>
Actividad 1 primer borrador
</commit_message>
<xml_diff>
--- a/docs/materiales/documentos/a1a-metodologia/a1a-metodologia.docx
+++ b/docs/materiales/documentos/a1a-metodologia/a1a-metodologia.docx
@@ -309,7 +309,7 @@
           <w:numId w:val="1002"/>
         </w:numPr>
       </w:pPr>
-      <w:hyperlink w:anchor="tbl-factibilidad">
+      <w:hyperlink w:anchor="tbl-ficha">
         <w:r>
           <w:rPr>
             <w:rStyle w:val="Hyperlink"/>
@@ -318,7 +318,7 @@
         </w:r>
       </w:hyperlink>
       <w:r>
-        <w:t xml:space="preserve">: Criterios del filtro de factibilidad</w:t>
+        <w:t xml:space="preserve">: Campos de la ficha normalizada de instrumento</w:t>
       </w:r>
     </w:p>
     <w:p>
@@ -329,7 +329,7 @@
           <w:numId w:val="1002"/>
         </w:numPr>
       </w:pPr>
-      <w:hyperlink w:anchor="tbl-capacidades">
+      <w:hyperlink w:anchor="tbl-factibilidad">
         <w:r>
           <w:rPr>
             <w:rStyle w:val="Hyperlink"/>
@@ -338,7 +338,7 @@
         </w:r>
       </w:hyperlink>
       <w:r>
-        <w:t xml:space="preserve">: Funciones evaluadas en el análisis de capacidades institucionales</w:t>
+        <w:t xml:space="preserve">: Criterios del filtro de factibilidad</w:t>
       </w:r>
     </w:p>
     <w:p>
@@ -349,12 +349,32 @@
           <w:numId w:val="1002"/>
         </w:numPr>
       </w:pPr>
+      <w:hyperlink w:anchor="tbl-capacidades">
+        <w:r>
+          <w:rPr>
+            <w:rStyle w:val="Hyperlink"/>
+          </w:rPr>
+          <w:t xml:space="preserve">Cuadro 7</w:t>
+        </w:r>
+      </w:hyperlink>
+      <w:r>
+        <w:t xml:space="preserve">: Funciones evaluadas en el análisis de capacidades institucionales</w:t>
+      </w:r>
+    </w:p>
+    <w:p>
+      <w:pPr>
+        <w:pStyle w:val="Compact"/>
+        <w:numPr>
+          <w:ilvl w:val="0"/>
+          <w:numId w:val="1002"/>
+        </w:numPr>
+      </w:pPr>
       <w:hyperlink w:anchor="tbl-actores">
         <w:r>
           <w:rPr>
             <w:rStyle w:val="Hyperlink"/>
           </w:rPr>
-          <w:t xml:space="preserve">Cuadro 7</w:t>
+          <w:t xml:space="preserve">Cuadro 8</w:t>
         </w:r>
       </w:hyperlink>
       <w:r>
@@ -394,7 +414,7 @@
           <w:rPr>
             <w:rStyle w:val="Hyperlink"/>
           </w:rPr>
-          <w:t xml:space="preserve">Cuadro 8</w:t>
+          <w:t xml:space="preserve">Cuadro 9</w:t>
         </w:r>
       </w:hyperlink>
       <w:r>
@@ -2687,7 +2707,7 @@
                       <w:szCs w:val="16"/>
                       <w:color w:val="000000"/>
                     </w:rPr>
-                    <w:t xml:space="preserve">Plan de trabajo y metodología; análisis de los sectores económicos priorizados con eslabonamientos productivos; identificación de instrumentos con experiencia internacional</w:t>
+                    <w:t xml:space="preserve">Plan de trabajo y metodología; análisis de los sectores económicos priorizados con eslabonamientos productivos; propuesta de catorce instrumentos con experiencia internacional</w:t>
                   </w:r>
                 </w:p>
               </w:tc>
@@ -3062,13 +3082,13 @@
         <w:t xml:space="preserve">6. Metodología de la Actividad 1: análisis sectorial e instrumentos</w:t>
       </w:r>
     </w:p>
-    <w:bookmarkStart w:id="38" w:name="pregunta-y-producto"/>
+    <w:bookmarkStart w:id="38" w:name="qué-se-busca-y-producto"/>
     <w:p>
       <w:pPr>
         <w:pStyle w:val="Heading2"/>
       </w:pPr>
       <w:r>
-        <w:t xml:space="preserve">6.1 Pregunta y producto</w:t>
+        <w:t xml:space="preserve">6.1 Qué se busca y producto</w:t>
       </w:r>
     </w:p>
     <w:p>
@@ -3076,7 +3096,7 @@
         <w:pStyle w:val="FirstParagraph"/>
       </w:pPr>
       <w:r>
-        <w:t xml:space="preserve">La Actividad 1 responde dónde están las mayores oportunidades y restricciones para la circularidad en la economía panameña y qué instrumentos de política han funcionado en otros países. Su producto es el plan de trabajo, esta metodología, el análisis de los sectores priorizados con sus eslabonamientos, y una propuesta de catorce instrumentos organizados por familia.</w:t>
+        <w:t xml:space="preserve">La Actividad 1 busca establecer dónde están las mayores oportunidades y restricciones para la circularidad en la economía panameña y qué instrumentos de política han funcionado en otros países. Su producto es el plan de trabajo, esta metodología, el análisis de los sectores priorizados con sus eslabonamientos, y una propuesta de catorce instrumentos organizados por familia.</w:t>
       </w:r>
     </w:p>
     <w:bookmarkEnd w:id="38"/>
@@ -6039,7 +6059,7 @@
     </w:p>
     <w:bookmarkEnd w:id="45"/>
     <w:bookmarkEnd w:id="46"/>
-    <w:bookmarkStart w:id="54" w:name="X89331e2fb77cee217192e09cd12146c58019d6e"/>
+    <w:bookmarkStart w:id="56" w:name="X89331e2fb77cee217192e09cd12146c58019d6e"/>
     <w:p>
       <w:pPr>
         <w:pStyle w:val="Heading1"/>
@@ -6048,13 +6068,13 @@
         <w:t xml:space="preserve">7. Metodología de la Actividad 2: factibilidad y capacidades</w:t>
       </w:r>
     </w:p>
-    <w:bookmarkStart w:id="47" w:name="pregunta-y-producto-1"/>
+    <w:bookmarkStart w:id="47" w:name="qué-se-busca-y-producto-1"/>
     <w:p>
       <w:pPr>
         <w:pStyle w:val="Heading2"/>
       </w:pPr>
       <w:r>
-        <w:t xml:space="preserve">7.1 Pregunta y producto</w:t>
+        <w:t xml:space="preserve">7.1 Qué se busca y producto</w:t>
       </w:r>
     </w:p>
     <w:p>
@@ -6062,17 +6082,17 @@
         <w:pStyle w:val="FirstParagraph"/>
       </w:pPr>
       <w:r>
-        <w:t xml:space="preserve">La Actividad 2 responde qué tan implementables y efectivos serían los instrumentos identificados, qué capacidades necesitan las instituciones y qué mecanismos permiten movilizar recursos desde el sistema financiero. Su producto es el segundo informe.</w:t>
+        <w:t xml:space="preserve">La Actividad 2 busca determinar cuáles de los catorce instrumentos propuestos en la Actividad 1 son viables y convenientes para Panamá, y bajo qué condiciones. Para ello se convierte cada instrumento en una ficha, se evalúa su factibilidad política, técnica, institucional y financiera, se estima su efecto por sector, se diagnostican las capacidades del gobierno y del sistema financiero, y se mapean los mecanismos que permiten movilizar recursos. La actividad no diseña todavía los instrumentos en detalle, pues eso corresponde a la Actividad 3. Su producto es el segundo informe.</w:t>
       </w:r>
     </w:p>
     <w:bookmarkEnd w:id="47"/>
-    <w:bookmarkStart w:id="49" w:name="evaluación-de-factibilidad"/>
+    <w:bookmarkStart w:id="49" w:name="fichas-normalizadas-y-lista-corta"/>
     <w:p>
       <w:pPr>
         <w:pStyle w:val="Heading2"/>
       </w:pPr>
       <w:r>
-        <w:t xml:space="preserve">7.2 Evaluación de factibilidad</w:t>
+        <w:t xml:space="preserve">7.2 Fichas normalizadas y lista corta</w:t>
       </w:r>
     </w:p>
     <w:p>
@@ -6080,12 +6100,9 @@
         <w:pStyle w:val="FirstParagraph"/>
       </w:pPr>
       <w:r>
-        <w:t xml:space="preserve">Cada instrumento de la lista corta se evalúa con los criterios de la</w:t>
-      </w:r>
-      <w:r>
-        <w:t xml:space="preserve"> </w:t>
-      </w:r>
-      <w:hyperlink w:anchor="tbl-factibilidad">
+        <w:t xml:space="preserve">Cada instrumento propuesto en la Actividad 1 se documenta con una ficha normalizada (</w:t>
+      </w:r>
+      <w:hyperlink w:anchor="tbl-ficha">
         <w:r>
           <w:rPr>
             <w:rStyle w:val="Hyperlink"/>
@@ -6094,7 +6111,7 @@
         </w:r>
       </w:hyperlink>
       <w:r>
-        <w:t xml:space="preserve">, en una escala ordinal con justificación escrita. La puntuación no determina la selección: ordena la discusión con los actores y hace explícitos los juicios.</w:t>
+        <w:t xml:space="preserve">), que reúne en un mismo formato lo que se sabe de él y lo que falta por confirmar. Con las fichas se define la lista corta de instrumentos que pasa a la evaluación detallada. La evidencia de cada ficha lleva su nivel de verificación, y lo que no pudo leerse en la fuente se marca como no verificado, de modo que el lector distinga lo establecido de lo reportado de segunda mano.</w:t>
       </w:r>
     </w:p>
     <w:tbl>
@@ -6110,7 +6127,7 @@
       <w:tr>
         <w:tc>
           <w:tcPr/>
-          <w:bookmarkStart w:id="48" w:name="tbl-factibilidad"/>
+          <w:bookmarkStart w:id="48" w:name="tbl-ficha"/>
           <w:p>
             <w:pPr>
               <w:pStyle w:val="ImageCaption"/>
@@ -6118,7 +6135,7 @@
               <w:jc w:val="left"/>
             </w:pPr>
             <w:r>
-              <w:t xml:space="preserve">Cuadro 5: Criterios del filtro de factibilidad</w:t>
+              <w:t xml:space="preserve">Cuadro 5: Campos de la ficha normalizada de instrumento</w:t>
             </w:r>
           </w:p>
           <w:tbl xmlns:w="http://schemas.openxmlformats.org/wordprocessingml/2006/main" xmlns:r="http://schemas.openxmlformats.org/officeDocument/2006/relationships" xmlns:w14="http://schemas.microsoft.com/office/word/2010/wordml" xmlns:wp="http://schemas.openxmlformats.org/drawingml/2006/wordprocessingDrawing" xmlns:a="http://schemas.openxmlformats.org/drawingml/2006/main" xmlns:pic="http://schemas.openxmlformats.org/drawingml/2006/picture">
@@ -6183,7 +6200,7 @@
                       <w:szCs w:val="16"/>
                       <w:color w:val="000000"/>
                     </w:rPr>
-                    <w:t xml:space="preserve">Criterio</w:t>
+                    <w:t xml:space="preserve">Campo</w:t>
                   </w:r>
                 </w:p>
               </w:tc>
@@ -6237,7 +6254,7 @@
                       <w:szCs w:val="16"/>
                       <w:color w:val="000000"/>
                     </w:rPr>
-                    <w:t xml:space="preserve">Pregunta de evaluación</w:t>
+                    <w:t xml:space="preserve">Contenido</w:t>
                   </w:r>
                 </w:p>
               </w:tc>
@@ -6296,7 +6313,7 @@
                       <w:szCs w:val="16"/>
                       <w:color w:val="000000"/>
                     </w:rPr>
-                    <w:t xml:space="preserve">Impacto potencial</w:t>
+                    <w:t xml:space="preserve">Problema o barrera</w:t>
                   </w:r>
                 </w:p>
               </w:tc>
@@ -6350,7 +6367,7 @@
                       <w:szCs w:val="16"/>
                       <w:color w:val="000000"/>
                     </w:rPr>
-                    <w:t xml:space="preserve">¿Puede movilizar recursos y cambiar prácticas hacia la circularidad?</w:t>
+                    <w:t xml:space="preserve">Precio, riesgo, financiamiento, coordinación, información, capacidad o cumplimiento que busca corregir</w:t>
                   </w:r>
                 </w:p>
               </w:tc>
@@ -6409,7 +6426,7 @@
                       <w:szCs w:val="16"/>
                       <w:color w:val="000000"/>
                     </w:rPr>
-                    <w:t xml:space="preserve">Factibilidad técnica</w:t>
+                    <w:t xml:space="preserve">Sector y flujo objetivo</w:t>
                   </w:r>
                 </w:p>
               </w:tc>
@@ -6463,7 +6480,7 @@
                       <w:szCs w:val="16"/>
                       <w:color w:val="000000"/>
                     </w:rPr>
-                    <w:t xml:space="preserve">¿Existen tecnología, mercado de materiales secundarios, trazabilidad, datos y capacidad de medición?</w:t>
+                    <w:t xml:space="preserve">Sector de política, producto o flujo de material, y actor cuyo comportamiento se pretende modificar</w:t>
                   </w:r>
                 </w:p>
               </w:tc>
@@ -6522,7 +6539,7 @@
                       <w:szCs w:val="16"/>
                       <w:color w:val="000000"/>
                     </w:rPr>
-                    <w:t xml:space="preserve">Factibilidad institucional</w:t>
+                    <w:t xml:space="preserve">Mecanismo</w:t>
                   </w:r>
                 </w:p>
               </w:tc>
@@ -6576,7 +6593,7 @@
                       <w:szCs w:val="16"/>
                       <w:color w:val="000000"/>
                     </w:rPr>
-                    <w:t xml:space="preserve">¿Hay mandato, coordinación, capacidad operativa y de supervisión?</w:t>
+                    <w:t xml:space="preserve">Incentivo, obligación, reducción de riesgo, señal de precio, acceso a capital o facilitación de inversión</w:t>
                   </w:r>
                 </w:p>
               </w:tc>
@@ -6635,7 +6652,7 @@
                       <w:szCs w:val="16"/>
                       <w:color w:val="000000"/>
                     </w:rPr>
-                    <w:t xml:space="preserve">Factibilidad política y regulatoria</w:t>
+                    <w:t xml:space="preserve">Requisitos normativos e institucionales</w:t>
                   </w:r>
                 </w:p>
               </w:tc>
@@ -6689,7 +6706,7 @@
                       <w:szCs w:val="16"/>
                       <w:color w:val="000000"/>
                     </w:rPr>
-                    <w:t xml:space="preserve">¿Es compatible con el marco legal, qué reformas requiere y qué aceptabilidad tiene entre los actores?</w:t>
+                    <w:t xml:space="preserve">Base legal necesaria, entidades responsables, capacidad de fiscalización y seguimiento</w:t>
                   </w:r>
                 </w:p>
               </w:tc>
@@ -6748,7 +6765,7 @@
                       <w:szCs w:val="16"/>
                       <w:color w:val="000000"/>
                     </w:rPr>
-                    <w:t xml:space="preserve">Factibilidad financiera</w:t>
+                    <w:t xml:space="preserve">Fuente de recursos</w:t>
                   </w:r>
                 </w:p>
               </w:tc>
@@ -6802,7 +6819,7 @@
                       <w:szCs w:val="16"/>
                       <w:color w:val="000000"/>
                     </w:rPr>
-                    <w:t xml:space="preserve">¿Cuál es la fuente de fondeo, el costo, el riesgo, la bancabilidad y el potencial de apalancamiento?</w:t>
+                    <w:t xml:space="preserve">Costo fiscal o financiero, potencial de apalancamiento y sostenibilidad del mecanismo</w:t>
                   </w:r>
                 </w:p>
               </w:tc>
@@ -6861,7 +6878,7 @@
                       <w:szCs w:val="16"/>
                       <w:color w:val="000000"/>
                     </w:rPr>
-                    <w:t xml:space="preserve">Tiempo de implementación</w:t>
+                    <w:t xml:space="preserve">Experiencia internacional</w:t>
                   </w:r>
                 </w:p>
               </w:tc>
@@ -6915,7 +6932,7 @@
                       <w:szCs w:val="16"/>
                       <w:color w:val="000000"/>
                     </w:rPr>
-                    <w:t xml:space="preserve">¿Es una acción inmediata, de mediano plazo o una reforma estructural?</w:t>
+                    <w:t xml:space="preserve">Países, base legal, año y evidencia de efectos, con su fuente y su grado de verificación</w:t>
                   </w:r>
                 </w:p>
               </w:tc>
@@ -6927,6 +6944,119 @@
               <w:tc>
                 <w:tcPr>
                   <w:tcBorders>
+                    <w:bottom w:val="none" w:sz="0" w:space="0" w:color="000000"/>
+                    <w:top w:val="none" w:sz="0" w:space="0" w:color="000000"/>
+                    <w:left w:val="none" w:sz="0" w:space="0" w:color="000000"/>
+                    <w:right w:val="none" w:sz="0" w:space="0" w:color="000000"/>
+                  </w:tcBorders>
+                  <w:shd w:val="clear" w:color="auto" w:fill="FFFFFF"/>
+                  <w:tcMar>
+                    <w:top w:w="0" w:type="dxa"/>
+                    <w:bottom w:w="0" w:type="dxa"/>
+                    <w:left w:w="0" w:type="dxa"/>
+                    <w:right w:w="0" w:type="dxa"/>
+                  </w:tcMar>
+                  <w:vAlign w:val="center"/>
+                </w:tcPr>
+                <w:p>
+                  <w:pPr>
+                    <w:jc w:val="left"/>
+                    <w:pBdr>
+                      <w:bottom w:val="none" w:sz="0" w:space="0" w:color="000000"/>
+                      <w:top w:val="none" w:sz="0" w:space="0" w:color="000000"/>
+                      <w:left w:val="none" w:sz="0" w:space="0" w:color="000000"/>
+                      <w:right w:val="none" w:sz="0" w:space="0" w:color="000000"/>
+                    </w:pBdr>
+                    <w:spacing w:after="60" w:before="60" w:line="240"/>
+                    <w:ind w:left="60" w:right="60" w:firstLine="0" w:firstLineChars="0"/>
+                    <w:rPr>
+                      <w:rFonts w:ascii="Arial" w:hAnsi="Helvetica" w:eastAsia="Helvetica" w:cs="Helvetica"/>
+                      <w:i w:val="false"/>
+                      <w:b w:val="false"/>
+                      <w:u w:val="none"/>
+                      <w:strike w:val="false"/>
+                      <w:sz w:val="16"/>
+                      <w:szCs w:val="16"/>
+                      <w:color w:val="000000"/>
+                    </w:rPr>
+                  </w:pPr>
+                  <w:r xmlns:w="http://schemas.openxmlformats.org/wordprocessingml/2006/main" xmlns:wp="http://schemas.openxmlformats.org/drawingml/2006/wordprocessingDrawing" xmlns:r="http://schemas.openxmlformats.org/officeDocument/2006/relationships" xmlns:w14="http://schemas.microsoft.com/office/word/2010/wordml">
+                    <w:rPr>
+                      <w:rFonts w:ascii="Arial" w:hAnsi="Helvetica" w:eastAsia="Helvetica" w:cs="Helvetica"/>
+                      <w:i w:val="false"/>
+                      <w:b w:val="false"/>
+                      <w:u w:val="none"/>
+                      <w:strike w:val="false"/>
+                      <w:sz w:val="16"/>
+                      <w:szCs w:val="16"/>
+                      <w:color w:val="000000"/>
+                    </w:rPr>
+                    <w:t xml:space="preserve">Datos e indicadores</w:t>
+                  </w:r>
+                </w:p>
+              </w:tc>
+              <w:tc>
+                <w:tcPr>
+                  <w:tcBorders>
+                    <w:bottom w:val="none" w:sz="0" w:space="0" w:color="000000"/>
+                    <w:top w:val="none" w:sz="0" w:space="0" w:color="000000"/>
+                    <w:left w:val="none" w:sz="0" w:space="0" w:color="000000"/>
+                    <w:right w:val="none" w:sz="0" w:space="0" w:color="000000"/>
+                  </w:tcBorders>
+                  <w:shd w:val="clear" w:color="auto" w:fill="FFFFFF"/>
+                  <w:tcMar>
+                    <w:top w:w="0" w:type="dxa"/>
+                    <w:bottom w:w="0" w:type="dxa"/>
+                    <w:left w:w="0" w:type="dxa"/>
+                    <w:right w:w="0" w:type="dxa"/>
+                  </w:tcMar>
+                  <w:vAlign w:val="center"/>
+                </w:tcPr>
+                <w:p>
+                  <w:pPr>
+                    <w:jc w:val="left"/>
+                    <w:pBdr>
+                      <w:bottom w:val="none" w:sz="0" w:space="0" w:color="000000"/>
+                      <w:top w:val="none" w:sz="0" w:space="0" w:color="000000"/>
+                      <w:left w:val="none" w:sz="0" w:space="0" w:color="000000"/>
+                      <w:right w:val="none" w:sz="0" w:space="0" w:color="000000"/>
+                    </w:pBdr>
+                    <w:spacing w:after="60" w:before="60" w:line="240"/>
+                    <w:ind w:left="60" w:right="60" w:firstLine="0" w:firstLineChars="0"/>
+                    <w:rPr>
+                      <w:rFonts w:ascii="Arial" w:hAnsi="Helvetica" w:eastAsia="Helvetica" w:cs="Helvetica"/>
+                      <w:i w:val="false"/>
+                      <w:b w:val="false"/>
+                      <w:u w:val="none"/>
+                      <w:strike w:val="false"/>
+                      <w:sz w:val="16"/>
+                      <w:szCs w:val="16"/>
+                      <w:color w:val="000000"/>
+                    </w:rPr>
+                  </w:pPr>
+                  <w:r xmlns:w="http://schemas.openxmlformats.org/wordprocessingml/2006/main" xmlns:wp="http://schemas.openxmlformats.org/drawingml/2006/wordprocessingDrawing" xmlns:r="http://schemas.openxmlformats.org/officeDocument/2006/relationships" xmlns:w14="http://schemas.microsoft.com/office/word/2010/wordml">
+                    <w:rPr>
+                      <w:rFonts w:ascii="Arial" w:hAnsi="Helvetica" w:eastAsia="Helvetica" w:cs="Helvetica"/>
+                      <w:i w:val="false"/>
+                      <w:b w:val="false"/>
+                      <w:u w:val="none"/>
+                      <w:strike w:val="false"/>
+                      <w:sz w:val="16"/>
+                      <w:szCs w:val="16"/>
+                      <w:color w:val="000000"/>
+                    </w:rPr>
+                    <w:t xml:space="preserve">Datos necesarios para implementarlo y monitorearlo</w:t>
+                  </w:r>
+                </w:p>
+              </w:tc>
+            </w:tr>
+            <w:tr>
+              <w:trPr>
+                <w:trHeight w:val="360" w:hRule="auto"/>
+              </w:trPr>
+              <w:tc>
+                <w:tcPr>
+                  <w:tcBorders>
                     <w:bottom w:val="single" w:sz="12" w:space="0" w:color="666666"/>
                     <w:top w:val="none" w:sz="0" w:space="0" w:color="000000"/>
                     <w:left w:val="none" w:sz="0" w:space="0" w:color="000000"/>
@@ -6974,7 +7104,7 @@
                       <w:szCs w:val="16"/>
                       <w:color w:val="000000"/>
                     </w:rPr>
-                    <w:t xml:space="preserve">Equidad y competitividad</w:t>
+                    <w:t xml:space="preserve">Riesgos</w:t>
                   </w:r>
                 </w:p>
               </w:tc>
@@ -7028,7 +7158,7 @@
                       <w:szCs w:val="16"/>
                       <w:color w:val="000000"/>
                     </w:rPr>
-                    <w:t xml:space="preserve">¿Cómo se distribuyen costos y beneficios y qué efectos tiene en las micro, pequeñas y medianas empresas, el empleo y la competencia?</w:t>
+                    <w:t xml:space="preserve">Elusión, efectos no deseados, efectos distributivos</w:t>
                   </w:r>
                 </w:p>
               </w:tc>
@@ -7052,13 +7182,13 @@
       </w:r>
     </w:p>
     <w:bookmarkEnd w:id="49"/>
-    <w:bookmarkStart w:id="50" w:name="análisis-de-efectos-por-sector"/>
+    <w:bookmarkStart w:id="51" w:name="evaluación-de-factibilidad"/>
     <w:p>
       <w:pPr>
         <w:pStyle w:val="Heading2"/>
       </w:pPr>
       <w:r>
-        <w:t xml:space="preserve">7.3 Análisis de efectos por sector</w:t>
+        <w:t xml:space="preserve">7.3 Evaluación de factibilidad</w:t>
       </w:r>
     </w:p>
     <w:p>
@@ -7066,47 +7196,12 @@
         <w:pStyle w:val="FirstParagraph"/>
       </w:pPr>
       <w:r>
-        <w:t xml:space="preserve">El análisis de efectos es cuantitativo cuando los datos lo permiten y cualitativo estructurado cuando no. Para los instrumentos que operan como un cargo sobre un producto (un impuesto, una tarifa de REP o un depósito), se usa el modelo de precios de insumo-producto: si un cargo eleva el costo de una actividad, el modelo traslada ese costo a los precios de las actividades que la usan como insumo, bajo el supuesto de traslado completo</w:t>
+        <w:t xml:space="preserve">Cada instrumento de la lista corta se evalúa con los criterios de la</w:t>
       </w:r>
       <w:r>
         <w:t xml:space="preserve"> </w:t>
       </w:r>
-      <w:r>
-        <w:t xml:space="preserve">(Miller y Blair, 2022)</w:t>
-      </w:r>
-      <w:r>
-        <w:t xml:space="preserve">. Con él se estima la incidencia sobre los sectores y sobre los hogares, a partir de los coeficientes de la matriz. Para los instrumentos financieros (garantías, líneas de crédito, bonos), el análisis se basa en la capacidad del sistema financiero, la demanda potencial de proyectos y las experiencias comparadas.</w:t>
-      </w:r>
-    </w:p>
-    <w:p>
-      <w:pPr>
-        <w:pStyle w:val="BodyText"/>
-      </w:pPr>
-      <w:r>
-        <w:t xml:space="preserve">Toda estimación se acompaña de una nota sobre la disponibilidad y el grado de confianza de los datos. Cuando la cuantificación no es defendible, se usa un análisis cualitativo con criterios y escalas explícitas, como corresponde cuando faltan datos.</w:t>
-      </w:r>
-    </w:p>
-    <w:bookmarkEnd w:id="50"/>
-    <w:bookmarkStart w:id="52" w:name="capacidades-institucionales"/>
-    <w:p>
-      <w:pPr>
-        <w:pStyle w:val="Heading2"/>
-      </w:pPr>
-      <w:r>
-        <w:t xml:space="preserve">7.4 Capacidades institucionales</w:t>
-      </w:r>
-    </w:p>
-    <w:p>
-      <w:pPr>
-        <w:pStyle w:val="FirstParagraph"/>
-      </w:pPr>
-      <w:r>
-        <w:t xml:space="preserve">La evaluación de capacidades de gobierno y del sistema financiero identifica fortalezas, brechas y necesidades de fortalecimiento en las funciones de la</w:t>
-      </w:r>
-      <w:r>
-        <w:t xml:space="preserve"> </w:t>
-      </w:r>
-      <w:hyperlink w:anchor="tbl-capacidades">
+      <w:hyperlink w:anchor="tbl-factibilidad">
         <w:r>
           <w:rPr>
             <w:rStyle w:val="Hyperlink"/>
@@ -7115,7 +7210,7 @@
         </w:r>
       </w:hyperlink>
       <w:r>
-        <w:t xml:space="preserve">. Se basa en el análisis de mandatos legales, en entrevistas semiestructuradas y en la revisión de informes institucionales.</w:t>
+        <w:t xml:space="preserve">, en una escala ordinal con justificación escrita. La puntuación no determina la selección: ordena la discusión con los actores y hace explícitos los juicios.</w:t>
       </w:r>
     </w:p>
     <w:tbl>
@@ -7131,7 +7226,7 @@
       <w:tr>
         <w:tc>
           <w:tcPr/>
-          <w:bookmarkStart w:id="51" w:name="tbl-capacidades"/>
+          <w:bookmarkStart w:id="50" w:name="tbl-factibilidad"/>
           <w:p>
             <w:pPr>
               <w:pStyle w:val="ImageCaption"/>
@@ -7139,7 +7234,7 @@
               <w:jc w:val="left"/>
             </w:pPr>
             <w:r>
-              <w:t xml:space="preserve">Cuadro 6: Funciones evaluadas en el análisis de capacidades institucionales</w:t>
+              <w:t xml:space="preserve">Cuadro 6: Criterios del filtro de factibilidad</w:t>
             </w:r>
           </w:p>
           <w:tbl xmlns:w="http://schemas.openxmlformats.org/wordprocessingml/2006/main" xmlns:r="http://schemas.openxmlformats.org/officeDocument/2006/relationships" xmlns:w14="http://schemas.microsoft.com/office/word/2010/wordml" xmlns:wp="http://schemas.openxmlformats.org/drawingml/2006/wordprocessingDrawing" xmlns:a="http://schemas.openxmlformats.org/drawingml/2006/main" xmlns:pic="http://schemas.openxmlformats.org/drawingml/2006/picture">
@@ -7204,7 +7299,7 @@
                       <w:szCs w:val="16"/>
                       <w:color w:val="000000"/>
                     </w:rPr>
-                    <w:t xml:space="preserve">Función</w:t>
+                    <w:t xml:space="preserve">Criterio</w:t>
                   </w:r>
                 </w:p>
               </w:tc>
@@ -7258,7 +7353,7 @@
                       <w:szCs w:val="16"/>
                       <w:color w:val="000000"/>
                     </w:rPr>
-                    <w:t xml:space="preserve">Qué se evalúa</w:t>
+                    <w:t xml:space="preserve">Pregunta de evaluación</w:t>
                   </w:r>
                 </w:p>
               </w:tc>
@@ -7317,7 +7412,7 @@
                       <w:szCs w:val="16"/>
                       <w:color w:val="000000"/>
                     </w:rPr>
-                    <w:t xml:space="preserve">Regular</w:t>
+                    <w:t xml:space="preserve">Impacto potencial</w:t>
                   </w:r>
                 </w:p>
               </w:tc>
@@ -7371,7 +7466,7 @@
                       <w:szCs w:val="16"/>
                       <w:color w:val="000000"/>
                     </w:rPr>
-                    <w:t xml:space="preserve">Mandato legal, capacidad de elaborar y modificar reglamentos, coordinación entre entidades</w:t>
+                    <w:t xml:space="preserve">¿Puede movilizar recursos y cambiar prácticas hacia la circularidad?</w:t>
                   </w:r>
                 </w:p>
               </w:tc>
@@ -7430,7 +7525,7 @@
                       <w:szCs w:val="16"/>
                       <w:color w:val="000000"/>
                     </w:rPr>
-                    <w:t xml:space="preserve">Registrar</w:t>
+                    <w:t xml:space="preserve">Factibilidad técnica</w:t>
                   </w:r>
                 </w:p>
               </w:tc>
@@ -7484,7 +7579,7 @@
                       <w:szCs w:val="16"/>
                       <w:color w:val="000000"/>
                     </w:rPr>
-                    <w:t xml:space="preserve">Registros de productores, importadores y gestores; interoperabilidad de datos</w:t>
+                    <w:t xml:space="preserve">¿Existen tecnología, mercado de materiales secundarios, trazabilidad, datos y capacidad de medición?</w:t>
                   </w:r>
                 </w:p>
               </w:tc>
@@ -7543,7 +7638,7 @@
                       <w:szCs w:val="16"/>
                       <w:color w:val="000000"/>
                     </w:rPr>
-                    <w:t xml:space="preserve">Recaudar y administrar recursos</w:t>
+                    <w:t xml:space="preserve">Factibilidad institucional</w:t>
                   </w:r>
                 </w:p>
               </w:tc>
@@ -7597,7 +7692,7 @@
                       <w:szCs w:val="16"/>
                       <w:color w:val="000000"/>
                     </w:rPr>
-                    <w:t xml:space="preserve">Capacidad de recaudar tarifas o tributos, de custodiar fondos y de asignarlos</w:t>
+                    <w:t xml:space="preserve">¿Hay mandato, coordinación, capacidad operativa y de supervisión?</w:t>
                   </w:r>
                 </w:p>
               </w:tc>
@@ -7656,7 +7751,7 @@
                       <w:szCs w:val="16"/>
                       <w:color w:val="000000"/>
                     </w:rPr>
-                    <w:t xml:space="preserve">Controlar y fiscalizar</w:t>
+                    <w:t xml:space="preserve">Factibilidad política y regulatoria</w:t>
                   </w:r>
                 </w:p>
               </w:tc>
@@ -7710,7 +7805,7 @@
                       <w:szCs w:val="16"/>
                       <w:color w:val="000000"/>
                     </w:rPr>
-                    <w:t xml:space="preserve">Inspección, auditoría de terceros, sanciones y capacidad aduanera</w:t>
+                    <w:t xml:space="preserve">¿Es compatible con el marco legal, qué reformas requiere y qué aceptabilidad tiene entre los actores?</w:t>
                   </w:r>
                 </w:p>
               </w:tc>
@@ -7769,7 +7864,7 @@
                       <w:szCs w:val="16"/>
                       <w:color w:val="000000"/>
                     </w:rPr>
-                    <w:t xml:space="preserve">Monitorear y reportar</w:t>
+                    <w:t xml:space="preserve">Factibilidad financiera</w:t>
                   </w:r>
                 </w:p>
               </w:tc>
@@ -7823,7 +7918,7 @@
                       <w:szCs w:val="16"/>
                       <w:color w:val="000000"/>
                     </w:rPr>
-                    <w:t xml:space="preserve">Indicadores, plataforma de información y reportes periódicos</w:t>
+                    <w:t xml:space="preserve">¿Cuál es la fuente de fondeo, el costo, el riesgo, la bancabilidad y el potencial de apalancamiento?</w:t>
                   </w:r>
                 </w:p>
               </w:tc>
@@ -7835,6 +7930,119 @@
               <w:tc>
                 <w:tcPr>
                   <w:tcBorders>
+                    <w:bottom w:val="none" w:sz="0" w:space="0" w:color="000000"/>
+                    <w:top w:val="none" w:sz="0" w:space="0" w:color="000000"/>
+                    <w:left w:val="none" w:sz="0" w:space="0" w:color="000000"/>
+                    <w:right w:val="none" w:sz="0" w:space="0" w:color="000000"/>
+                  </w:tcBorders>
+                  <w:shd w:val="clear" w:color="auto" w:fill="FFFFFF"/>
+                  <w:tcMar>
+                    <w:top w:w="0" w:type="dxa"/>
+                    <w:bottom w:w="0" w:type="dxa"/>
+                    <w:left w:w="0" w:type="dxa"/>
+                    <w:right w:w="0" w:type="dxa"/>
+                  </w:tcMar>
+                  <w:vAlign w:val="center"/>
+                </w:tcPr>
+                <w:p>
+                  <w:pPr>
+                    <w:jc w:val="left"/>
+                    <w:pBdr>
+                      <w:bottom w:val="none" w:sz="0" w:space="0" w:color="000000"/>
+                      <w:top w:val="none" w:sz="0" w:space="0" w:color="000000"/>
+                      <w:left w:val="none" w:sz="0" w:space="0" w:color="000000"/>
+                      <w:right w:val="none" w:sz="0" w:space="0" w:color="000000"/>
+                    </w:pBdr>
+                    <w:spacing w:after="60" w:before="60" w:line="240"/>
+                    <w:ind w:left="60" w:right="60" w:firstLine="0" w:firstLineChars="0"/>
+                    <w:rPr>
+                      <w:rFonts w:ascii="Arial" w:hAnsi="Helvetica" w:eastAsia="Helvetica" w:cs="Helvetica"/>
+                      <w:i w:val="false"/>
+                      <w:b w:val="false"/>
+                      <w:u w:val="none"/>
+                      <w:strike w:val="false"/>
+                      <w:sz w:val="16"/>
+                      <w:szCs w:val="16"/>
+                      <w:color w:val="000000"/>
+                    </w:rPr>
+                  </w:pPr>
+                  <w:r xmlns:w="http://schemas.openxmlformats.org/wordprocessingml/2006/main" xmlns:wp="http://schemas.openxmlformats.org/drawingml/2006/wordprocessingDrawing" xmlns:r="http://schemas.openxmlformats.org/officeDocument/2006/relationships" xmlns:w14="http://schemas.microsoft.com/office/word/2010/wordml">
+                    <w:rPr>
+                      <w:rFonts w:ascii="Arial" w:hAnsi="Helvetica" w:eastAsia="Helvetica" w:cs="Helvetica"/>
+                      <w:i w:val="false"/>
+                      <w:b w:val="false"/>
+                      <w:u w:val="none"/>
+                      <w:strike w:val="false"/>
+                      <w:sz w:val="16"/>
+                      <w:szCs w:val="16"/>
+                      <w:color w:val="000000"/>
+                    </w:rPr>
+                    <w:t xml:space="preserve">Tiempo de implementación</w:t>
+                  </w:r>
+                </w:p>
+              </w:tc>
+              <w:tc>
+                <w:tcPr>
+                  <w:tcBorders>
+                    <w:bottom w:val="none" w:sz="0" w:space="0" w:color="000000"/>
+                    <w:top w:val="none" w:sz="0" w:space="0" w:color="000000"/>
+                    <w:left w:val="none" w:sz="0" w:space="0" w:color="000000"/>
+                    <w:right w:val="none" w:sz="0" w:space="0" w:color="000000"/>
+                  </w:tcBorders>
+                  <w:shd w:val="clear" w:color="auto" w:fill="FFFFFF"/>
+                  <w:tcMar>
+                    <w:top w:w="0" w:type="dxa"/>
+                    <w:bottom w:w="0" w:type="dxa"/>
+                    <w:left w:w="0" w:type="dxa"/>
+                    <w:right w:w="0" w:type="dxa"/>
+                  </w:tcMar>
+                  <w:vAlign w:val="center"/>
+                </w:tcPr>
+                <w:p>
+                  <w:pPr>
+                    <w:jc w:val="left"/>
+                    <w:pBdr>
+                      <w:bottom w:val="none" w:sz="0" w:space="0" w:color="000000"/>
+                      <w:top w:val="none" w:sz="0" w:space="0" w:color="000000"/>
+                      <w:left w:val="none" w:sz="0" w:space="0" w:color="000000"/>
+                      <w:right w:val="none" w:sz="0" w:space="0" w:color="000000"/>
+                    </w:pBdr>
+                    <w:spacing w:after="60" w:before="60" w:line="240"/>
+                    <w:ind w:left="60" w:right="60" w:firstLine="0" w:firstLineChars="0"/>
+                    <w:rPr>
+                      <w:rFonts w:ascii="Arial" w:hAnsi="Helvetica" w:eastAsia="Helvetica" w:cs="Helvetica"/>
+                      <w:i w:val="false"/>
+                      <w:b w:val="false"/>
+                      <w:u w:val="none"/>
+                      <w:strike w:val="false"/>
+                      <w:sz w:val="16"/>
+                      <w:szCs w:val="16"/>
+                      <w:color w:val="000000"/>
+                    </w:rPr>
+                  </w:pPr>
+                  <w:r xmlns:w="http://schemas.openxmlformats.org/wordprocessingml/2006/main" xmlns:wp="http://schemas.openxmlformats.org/drawingml/2006/wordprocessingDrawing" xmlns:r="http://schemas.openxmlformats.org/officeDocument/2006/relationships" xmlns:w14="http://schemas.microsoft.com/office/word/2010/wordml">
+                    <w:rPr>
+                      <w:rFonts w:ascii="Arial" w:hAnsi="Helvetica" w:eastAsia="Helvetica" w:cs="Helvetica"/>
+                      <w:i w:val="false"/>
+                      <w:b w:val="false"/>
+                      <w:u w:val="none"/>
+                      <w:strike w:val="false"/>
+                      <w:sz w:val="16"/>
+                      <w:szCs w:val="16"/>
+                      <w:color w:val="000000"/>
+                    </w:rPr>
+                    <w:t xml:space="preserve">¿Es una acción inmediata, de mediano plazo o una reforma estructural?</w:t>
+                  </w:r>
+                </w:p>
+              </w:tc>
+            </w:tr>
+            <w:tr>
+              <w:trPr>
+                <w:trHeight w:val="360" w:hRule="auto"/>
+              </w:trPr>
+              <w:tc>
+                <w:tcPr>
+                  <w:tcBorders>
                     <w:bottom w:val="single" w:sz="12" w:space="0" w:color="666666"/>
                     <w:top w:val="none" w:sz="0" w:space="0" w:color="000000"/>
                     <w:left w:val="none" w:sz="0" w:space="0" w:color="000000"/>
@@ -7882,7 +8090,7 @@
                       <w:szCs w:val="16"/>
                       <w:color w:val="000000"/>
                     </w:rPr>
-                    <w:t xml:space="preserve">Financiar</w:t>
+                    <w:t xml:space="preserve">Equidad y competitividad</w:t>
                   </w:r>
                 </w:p>
               </w:tc>
@@ -7936,13 +8144,13 @@
                       <w:szCs w:val="16"/>
                       <w:color w:val="000000"/>
                     </w:rPr>
-                    <w:t xml:space="preserve">Productos financieros, evaluación de riesgo de proyectos circulares y bancabilidad</w:t>
+                    <w:t xml:space="preserve">¿Cómo se distribuyen costos y beneficios y qué efectos tiene en las micro, pequeñas y medianas empresas, el empleo y la competencia?</w:t>
                   </w:r>
                 </w:p>
               </w:tc>
             </w:tr>
           </w:tbl>
-          <w:bookmarkEnd w:id="51"/>
+          <w:bookmarkEnd w:id="50"/>
           <w:p/>
         </w:tc>
       </w:tr>
@@ -7959,14 +8167,14 @@
         <w:t xml:space="preserve">Fuente: elaboración propia.</w:t>
       </w:r>
     </w:p>
-    <w:bookmarkEnd w:id="52"/>
-    <w:bookmarkStart w:id="53" w:name="análisis-del-sistema-financiero"/>
+    <w:bookmarkEnd w:id="51"/>
+    <w:bookmarkStart w:id="52" w:name="análisis-de-efectos-por-sector"/>
     <w:p>
       <w:pPr>
         <w:pStyle w:val="Heading2"/>
       </w:pPr>
       <w:r>
-        <w:t xml:space="preserve">7.5 Análisis del sistema financiero</w:t>
+        <w:t xml:space="preserve">7.4 Análisis de efectos por sector</w:t>
       </w:r>
     </w:p>
     <w:p>
@@ -7974,243 +8182,47 @@
         <w:pStyle w:val="FirstParagraph"/>
       </w:pPr>
       <w:r>
-        <w:t xml:space="preserve">El análisis del sistema financiero mapea los actores (banca pública y privada, fondos de inversión, aseguradoras, mercado de valores, financiamiento verde y otras fuentes de financiamiento sostenible), los instrumentos que ofrecen y las barreras que enfrentan los proyectos circulares. Se articula con la taxonomía de finanzas sostenibles</w:t>
+        <w:t xml:space="preserve">El análisis de efectos es cuantitativo cuando los datos lo permiten y cualitativo estructurado cuando no. Para los instrumentos que operan como un cargo sobre un producto (un impuesto, una tarifa de REP o un depósito), se usa el modelo de precios de insumo-producto: si un cargo eleva el costo de una actividad, el modelo traslada ese costo a los precios de las actividades que la usan como insumo, bajo el supuesto de traslado completo</w:t>
       </w:r>
       <w:r>
         <w:t xml:space="preserve"> </w:t>
       </w:r>
       <w:r>
-        <w:t xml:space="preserve">(Superintendencia de Bancos de Panamá et al., 2024)</w:t>
-      </w:r>
-      <w:r>
-        <w:t xml:space="preserve"> </w:t>
-      </w:r>
-      <w:r>
-        <w:t xml:space="preserve">y con el marco soberano de financiamiento sostenible</w:t>
-      </w:r>
-      <w:r>
-        <w:t xml:space="preserve"> </w:t>
-      </w:r>
-      <w:r>
-        <w:t xml:space="preserve">(Ministerio de Economía y Finanzas de Panamá, 2024)</w:t>
-      </w:r>
-      <w:r>
-        <w:t xml:space="preserve">. El aporte diferenciado es cerrar la brecha entre lo que la taxonomía define como elegible y la demanda real de proyectos circulares financiables.</w:t>
-      </w:r>
-    </w:p>
-    <w:bookmarkEnd w:id="53"/>
-    <w:bookmarkEnd w:id="54"/>
-    <w:bookmarkStart w:id="55" w:name="X400ac7d34e5c8d1bb0e2d8c345760bdd51cb73f"/>
-    <w:p>
-      <w:pPr>
-        <w:pStyle w:val="Heading1"/>
-      </w:pPr>
-      <w:r>
-        <w:t xml:space="preserve">8. Metodología de la Actividad 3: Hoja de Ruta</w:t>
+        <w:t xml:space="preserve">(Miller y Blair, 2022)</w:t>
+      </w:r>
+      <w:r>
+        <w:t xml:space="preserve">. Con él se estima la incidencia sobre los sectores y sobre los hogares, a partir de los coeficientes de la matriz. Para los instrumentos financieros (garantías, líneas de crédito, bonos), el análisis se basa en la capacidad del sistema financiero, la demanda potencial de proyectos y las experiencias comparadas.</w:t>
       </w:r>
     </w:p>
     <w:p>
       <w:pPr>
-        <w:pStyle w:val="FirstParagraph"/>
-      </w:pPr>
-      <w:r>
-        <w:t xml:space="preserve">La Actividad 3 consolida el trabajo anterior en una Hoja de Ruta Nacional para el Financiamiento de la Economía Circular. Su contenido es: el diseño de los instrumentos financieros aplicables a la realidad nacional, incluidos los modelos de REP; los actores responsables y sus roles en la implementación, el seguimiento y la evaluación; el mapeo de fuentes de financiamiento nacionales e internacionales, públicas y privadas; las reformas normativas, regulatorias o institucionales requeridas; los indicadores de seguimiento y evaluación; y la articulación con la Ley 502 y otros instrumentos nacionales.</w:t>
+        <w:pStyle w:val="BodyText"/>
+      </w:pPr>
+      <w:r>
+        <w:t xml:space="preserve">Toda estimación se acompaña de una nota sobre la disponibilidad y el grado de confianza de los datos. Cuando la cuantificación no es defendible, se usa un análisis cualitativo con criterios y escalas explícitas, como corresponde cuando faltan datos.</w:t>
+      </w:r>
+    </w:p>
+    <w:bookmarkEnd w:id="52"/>
+    <w:bookmarkStart w:id="54" w:name="capacidades-institucionales"/>
+    <w:p>
+      <w:pPr>
+        <w:pStyle w:val="Heading2"/>
+      </w:pPr>
+      <w:r>
+        <w:t xml:space="preserve">7.5 Capacidades institucionales</w:t>
       </w:r>
     </w:p>
     <w:p>
       <w:pPr>
-        <w:pStyle w:val="BodyText"/>
-      </w:pPr>
-      <w:r>
-        <w:t xml:space="preserve">Para ordenar las recomendaciones se aplican tres reglas:</w:t>
-      </w:r>
-    </w:p>
-    <w:p>
-      <w:pPr>
-        <w:pStyle w:val="Compact"/>
-        <w:numPr>
-          <w:ilvl w:val="0"/>
-          <w:numId w:val="1005"/>
-        </w:numPr>
-      </w:pPr>
-      <w:r>
-        <w:rPr>
-          <w:b/>
-          <w:bCs/>
-        </w:rPr>
-        <w:t xml:space="preserve">Secuencia en dos pasos.</w:t>
+        <w:pStyle w:val="FirstParagraph"/>
+      </w:pPr>
+      <w:r>
+        <w:t xml:space="preserve">La evaluación de capacidades de gobierno y del sistema financiero identifica fortalezas, brechas y necesidades de fortalecimiento en las funciones de la</w:t>
       </w:r>
       <w:r>
         <w:t xml:space="preserve"> </w:t>
       </w:r>
-      <w:r>
-        <w:t xml:space="preserve">Primero los instrumentos habilitantes (registro, trazabilidad, capacidad institucional) y después los que dependen de ellos, como tarifas, impuestos y metas.</w:t>
-      </w:r>
-    </w:p>
-    <w:p>
-      <w:pPr>
-        <w:pStyle w:val="Compact"/>
-        <w:numPr>
-          <w:ilvl w:val="0"/>
-          <w:numId w:val="1005"/>
-        </w:numPr>
-      </w:pPr>
-      <w:r>
-        <w:rPr>
-          <w:b/>
-          <w:bCs/>
-        </w:rPr>
-        <w:t xml:space="preserve">Utilización de la institucionalidad existente.</w:t>
-      </w:r>
-      <w:r>
-        <w:t xml:space="preserve"> </w:t>
-      </w:r>
-      <w:r>
-        <w:t xml:space="preserve">Se prefieren los mecanismos que se apoyan en instrumentos ya vigentes, como los incentivos del Ministerio de Comercio e Industrias, la taxonomía y el marco soberano de financiamiento, antes que crear instrumentos nuevos.</w:t>
-      </w:r>
-    </w:p>
-    <w:p>
-      <w:pPr>
-        <w:pStyle w:val="Compact"/>
-        <w:numPr>
-          <w:ilvl w:val="0"/>
-          <w:numId w:val="1005"/>
-        </w:numPr>
-      </w:pPr>
-      <w:r>
-        <w:rPr>
-          <w:b/>
-          <w:bCs/>
-        </w:rPr>
-        <w:t xml:space="preserve">Trazabilidad de cada recomendación.</w:t>
-      </w:r>
-      <w:r>
-        <w:t xml:space="preserve"> </w:t>
-      </w:r>
-      <w:r>
-        <w:t xml:space="preserve">Cada recomendación se rastrea hasta una fuente, un criterio de selección y una necesidad institucional o de mercado identificada.</w:t>
-      </w:r>
-    </w:p>
-    <w:p>
-      <w:pPr>
-        <w:pStyle w:val="FirstParagraph"/>
-      </w:pPr>
-      <w:r>
-        <w:t xml:space="preserve">Los indicadores de seguimiento se diseñan en coordinación con la plataforma de indicadores que ordena la Ley 502</w:t>
-      </w:r>
-      <w:r>
-        <w:t xml:space="preserve"> </w:t>
-      </w:r>
-      <w:r>
-        <w:t xml:space="preserve">(Asamblea Nacional de Panamá, 2025, art. 11)</w:t>
-      </w:r>
-      <w:r>
-        <w:t xml:space="preserve">, para que sirvan al seguimiento de la ley y de los instrumentos que se desarrollen en su marco.</w:t>
-      </w:r>
-    </w:p>
-    <w:bookmarkEnd w:id="55"/>
-    <w:bookmarkStart w:id="60" w:name="estrategia-de-datos-y-control-de-calidad"/>
-    <w:p>
-      <w:pPr>
-        <w:pStyle w:val="Heading1"/>
-      </w:pPr>
-      <w:r>
-        <w:t xml:space="preserve">9. Estrategia de datos y control de calidad</w:t>
-      </w:r>
-    </w:p>
-    <w:bookmarkStart w:id="56" w:name="principios"/>
-    <w:p>
-      <w:pPr>
-        <w:pStyle w:val="Heading2"/>
-      </w:pPr>
-      <w:r>
-        <w:t xml:space="preserve">9.1 Principios</w:t>
-      </w:r>
-    </w:p>
-    <w:p>
-      <w:pPr>
-        <w:pStyle w:val="FirstParagraph"/>
-      </w:pPr>
-      <w:r>
-        <w:t xml:space="preserve">La estrategia de datos sigue un orden de preferencia: primero información oficial nacional, luego fuentes internacionales comparables y por último proxies o evidencia cualitativa cuando hay vacíos. Toda cifra utilizada proviene de una base de datos construida por la consultoría, y cada base tiene una memoria de cálculo pública que documenta los pasos en código, de modo que pueden auditarse y reproducirse. Las memorias cubren la equivalencia de sectores, las cuentas por actividad, el empleo, los eslabonamientos, las emisiones, los recursos y residuos, la inversión y la estructura empresarial, y la síntesis sectorial.</w:t>
-      </w:r>
-    </w:p>
-    <w:bookmarkEnd w:id="56"/>
-    <w:bookmarkStart w:id="57" w:name="registro-de-brechas"/>
-    <w:p>
-      <w:pPr>
-        <w:pStyle w:val="Heading2"/>
-      </w:pPr>
-      <w:r>
-        <w:t xml:space="preserve">9.2 Registro de brechas</w:t>
-      </w:r>
-    </w:p>
-    <w:p>
-      <w:pPr>
-        <w:pStyle w:val="FirstParagraph"/>
-      </w:pPr>
-      <w:r>
-        <w:t xml:space="preserve">La consultoría mantiene un registro de vacíos de información y de las decisiones que se tomaron para suplirlos. Las brechas más relevantes son la ausencia de cuotas de mercado, de datos sobre recicladores de base y de series anuales de residuos. Cada brecha se traduce en una solicitud de información por las vías formales, con la contraparte, y en un tratamiento alternativo documentado. La coordinación con la consultoría de sistema de información e indicadores del programa evita duplicar solicitudes.</w:t>
-      </w:r>
-    </w:p>
-    <w:bookmarkEnd w:id="57"/>
-    <w:bookmarkStart w:id="58" w:name="reproducibilidad"/>
-    <w:p>
-      <w:pPr>
-        <w:pStyle w:val="Heading2"/>
-      </w:pPr>
-      <w:r>
-        <w:t xml:space="preserve">9.3 Reproducibilidad</w:t>
-      </w:r>
-    </w:p>
-    <w:p>
-      <w:pPr>
-        <w:pStyle w:val="FirstParagraph"/>
-      </w:pPr>
-      <w:r>
-        <w:t xml:space="preserve">Los cálculos se hacen en un solo lenguaje de programación (R) y con rutas relativas al proyecto, de modo que quien tenga los datos de origen puede regenerar las bases. El código se versiona y las bases de resultados se exportan en formatos abiertos y editables. La bibliografía de cada documento se arma a partir de una bibliografía maestra con las fuentes verificadas.</w:t>
-      </w:r>
-    </w:p>
-    <w:bookmarkEnd w:id="58"/>
-    <w:bookmarkStart w:id="59" w:name="X8c49f04d0b51d6c1fb8c41cdc27788e2b3bf87c"/>
-    <w:p>
-      <w:pPr>
-        <w:pStyle w:val="Heading2"/>
-      </w:pPr>
-      <w:r>
-        <w:t xml:space="preserve">9.4 Tratamiento de la evidencia internacional</w:t>
-      </w:r>
-    </w:p>
-    <w:p>
-      <w:pPr>
-        <w:pStyle w:val="FirstParagraph"/>
-      </w:pPr>
-      <w:r>
-        <w:t xml:space="preserve">La evidencia sobre instrumentos proviene de leyes, informes técnicos de instituciones y estudios de acceso abierto. Cada dato lleva su fuente y página. Lo que no se pudo leer en el original, por ejemplo cuando un sitio bloqueó la descarga, se marca como no verificado y no se usa como base de recomendaciones.</w:t>
-      </w:r>
-    </w:p>
-    <w:bookmarkEnd w:id="59"/>
-    <w:bookmarkEnd w:id="60"/>
-    <w:bookmarkStart w:id="62" w:name="participación-de-actores"/>
-    <w:p>
-      <w:pPr>
-        <w:pStyle w:val="Heading1"/>
-      </w:pPr>
-      <w:r>
-        <w:t xml:space="preserve">10. Participación de actores</w:t>
-      </w:r>
-    </w:p>
-    <w:p>
-      <w:pPr>
-        <w:pStyle w:val="FirstParagraph"/>
-      </w:pPr>
-      <w:r>
-        <w:t xml:space="preserve">La participación no se limita a la mesa técnica de validación final. Se realizan entrevistas semiestructuradas y reuniones técnicas durante el desarrollo de las actividades, para completar vacíos de datos, probar la factibilidad, identificar incentivos y anticipar cuellos de botella. La</w:t>
-      </w:r>
-      <w:r>
-        <w:t xml:space="preserve"> </w:t>
-      </w:r>
-      <w:hyperlink w:anchor="tbl-actores">
+      <w:hyperlink w:anchor="tbl-capacidades">
         <w:r>
           <w:rPr>
             <w:rStyle w:val="Hyperlink"/>
@@ -8219,10 +8231,7 @@
         </w:r>
       </w:hyperlink>
       <w:r>
-        <w:t xml:space="preserve"> </w:t>
-      </w:r>
-      <w:r>
-        <w:t xml:space="preserve">resume los grupos y su propósito.</w:t>
+        <w:t xml:space="preserve">. Se basa en el análisis de mandatos legales, en entrevistas semiestructuradas y en la revisión de informes institucionales.</w:t>
       </w:r>
     </w:p>
     <w:tbl>
@@ -8238,7 +8247,7 @@
       <w:tr>
         <w:tc>
           <w:tcPr/>
-          <w:bookmarkStart w:id="61" w:name="tbl-actores"/>
+          <w:bookmarkStart w:id="53" w:name="tbl-capacidades"/>
           <w:p>
             <w:pPr>
               <w:pStyle w:val="ImageCaption"/>
@@ -8246,7 +8255,7 @@
               <w:jc w:val="left"/>
             </w:pPr>
             <w:r>
-              <w:t xml:space="preserve">Cuadro 7: Grupos de actores y mecanismos de consulta</w:t>
+              <w:t xml:space="preserve">Cuadro 7: Funciones evaluadas en el análisis de capacidades institucionales</w:t>
             </w:r>
           </w:p>
           <w:tbl xmlns:w="http://schemas.openxmlformats.org/wordprocessingml/2006/main" xmlns:r="http://schemas.openxmlformats.org/officeDocument/2006/relationships" xmlns:w14="http://schemas.microsoft.com/office/word/2010/wordml" xmlns:wp="http://schemas.openxmlformats.org/drawingml/2006/wordprocessingDrawing" xmlns:a="http://schemas.openxmlformats.org/drawingml/2006/main" xmlns:pic="http://schemas.openxmlformats.org/drawingml/2006/picture">
@@ -8311,7 +8320,7 @@
                       <w:szCs w:val="16"/>
                       <w:color w:val="000000"/>
                     </w:rPr>
-                    <w:t xml:space="preserve">Grupo</w:t>
+                    <w:t xml:space="preserve">Función</w:t>
                   </w:r>
                 </w:p>
               </w:tc>
@@ -8365,61 +8374,7 @@
                       <w:szCs w:val="16"/>
                       <w:color w:val="000000"/>
                     </w:rPr>
-                    <w:t xml:space="preserve">Propósito de la consulta</w:t>
-                  </w:r>
-                </w:p>
-              </w:tc>
-              <w:tc>
-                <w:tcPr>
-                  <w:tcBorders>
-                    <w:bottom w:val="single" w:sz="12" w:space="0" w:color="666666"/>
-                    <w:top w:val="single" w:sz="12" w:space="0" w:color="666666"/>
-                    <w:left w:val="none" w:sz="0" w:space="0" w:color="000000"/>
-                    <w:right w:val="none" w:sz="0" w:space="0" w:color="000000"/>
-                  </w:tcBorders>
-                  <w:shd w:val="clear" w:color="auto" w:fill="FFFFFF"/>
-                  <w:tcMar>
-                    <w:top w:w="0" w:type="dxa"/>
-                    <w:bottom w:w="0" w:type="dxa"/>
-                    <w:left w:w="0" w:type="dxa"/>
-                    <w:right w:w="0" w:type="dxa"/>
-                  </w:tcMar>
-                  <w:vAlign w:val="center"/>
-                </w:tcPr>
-                <w:p>
-                  <w:pPr>
-                    <w:jc w:val="left"/>
-                    <w:pBdr>
-                      <w:bottom w:val="none" w:sz="0" w:space="0" w:color="000000"/>
-                      <w:top w:val="none" w:sz="0" w:space="0" w:color="000000"/>
-                      <w:left w:val="none" w:sz="0" w:space="0" w:color="000000"/>
-                      <w:right w:val="none" w:sz="0" w:space="0" w:color="000000"/>
-                    </w:pBdr>
-                    <w:spacing w:after="60" w:before="60" w:line="240"/>
-                    <w:ind w:left="60" w:right="60" w:firstLine="0" w:firstLineChars="0"/>
-                    <w:rPr>
-                      <w:rFonts w:ascii="Arial" w:hAnsi="Helvetica" w:eastAsia="Helvetica" w:cs="Helvetica"/>
-                      <w:i w:val="false"/>
-                      <w:b w:val="false"/>
-                      <w:u w:val="none"/>
-                      <w:strike w:val="false"/>
-                      <w:sz w:val="16"/>
-                      <w:szCs w:val="16"/>
-                      <w:color w:val="000000"/>
-                    </w:rPr>
-                  </w:pPr>
-                  <w:r xmlns:w="http://schemas.openxmlformats.org/wordprocessingml/2006/main" xmlns:wp="http://schemas.openxmlformats.org/drawingml/2006/wordprocessingDrawing" xmlns:r="http://schemas.openxmlformats.org/officeDocument/2006/relationships" xmlns:w14="http://schemas.microsoft.com/office/word/2010/wordml">
-                    <w:rPr>
-                      <w:rFonts w:ascii="Arial" w:hAnsi="Helvetica" w:eastAsia="Helvetica" w:cs="Helvetica"/>
-                      <w:i w:val="false"/>
-                      <w:b w:val="false"/>
-                      <w:u w:val="none"/>
-                      <w:strike w:val="false"/>
-                      <w:sz w:val="16"/>
-                      <w:szCs w:val="16"/>
-                      <w:color w:val="000000"/>
-                    </w:rPr>
-                    <w:t xml:space="preserve">Mecanismo</w:t>
+                    <w:t xml:space="preserve">Qué se evalúa</w:t>
                   </w:r>
                 </w:p>
               </w:tc>
@@ -8478,7 +8433,7 @@
                       <w:szCs w:val="16"/>
                       <w:color w:val="000000"/>
                     </w:rPr>
-                    <w:t xml:space="preserve">Gobierno</w:t>
+                    <w:t xml:space="preserve">Regular</w:t>
                   </w:r>
                 </w:p>
               </w:tc>
@@ -8532,61 +8487,7 @@
                       <w:szCs w:val="16"/>
                       <w:color w:val="000000"/>
                     </w:rPr>
-                    <w:t xml:space="preserve">MiAMBIENTE y entidades con competencias económicas, financieras, productivas, comerciales, tributarias, municipales y de gestión de residuos; el Ministerio de Economía y Finanzas, incluida la Dirección de Crédito Público</w:t>
-                  </w:r>
-                </w:p>
-              </w:tc>
-              <w:tc>
-                <w:tcPr>
-                  <w:tcBorders>
-                    <w:bottom w:val="none" w:sz="0" w:space="0" w:color="000000"/>
-                    <w:top w:val="single" w:sz="12" w:space="0" w:color="666666"/>
-                    <w:left w:val="none" w:sz="0" w:space="0" w:color="000000"/>
-                    <w:right w:val="none" w:sz="0" w:space="0" w:color="000000"/>
-                  </w:tcBorders>
-                  <w:shd w:val="clear" w:color="auto" w:fill="FFFFFF"/>
-                  <w:tcMar>
-                    <w:top w:w="0" w:type="dxa"/>
-                    <w:bottom w:w="0" w:type="dxa"/>
-                    <w:left w:w="0" w:type="dxa"/>
-                    <w:right w:w="0" w:type="dxa"/>
-                  </w:tcMar>
-                  <w:vAlign w:val="center"/>
-                </w:tcPr>
-                <w:p>
-                  <w:pPr>
-                    <w:jc w:val="left"/>
-                    <w:pBdr>
-                      <w:bottom w:val="none" w:sz="0" w:space="0" w:color="000000"/>
-                      <w:top w:val="none" w:sz="0" w:space="0" w:color="000000"/>
-                      <w:left w:val="none" w:sz="0" w:space="0" w:color="000000"/>
-                      <w:right w:val="none" w:sz="0" w:space="0" w:color="000000"/>
-                    </w:pBdr>
-                    <w:spacing w:after="60" w:before="60" w:line="240"/>
-                    <w:ind w:left="60" w:right="60" w:firstLine="0" w:firstLineChars="0"/>
-                    <w:rPr>
-                      <w:rFonts w:ascii="Arial" w:hAnsi="Helvetica" w:eastAsia="Helvetica" w:cs="Helvetica"/>
-                      <w:i w:val="false"/>
-                      <w:b w:val="false"/>
-                      <w:u w:val="none"/>
-                      <w:strike w:val="false"/>
-                      <w:sz w:val="16"/>
-                      <w:szCs w:val="16"/>
-                      <w:color w:val="000000"/>
-                    </w:rPr>
-                  </w:pPr>
-                  <w:r xmlns:w="http://schemas.openxmlformats.org/wordprocessingml/2006/main" xmlns:wp="http://schemas.openxmlformats.org/drawingml/2006/wordprocessingDrawing" xmlns:r="http://schemas.openxmlformats.org/officeDocument/2006/relationships" xmlns:w14="http://schemas.microsoft.com/office/word/2010/wordml">
-                    <w:rPr>
-                      <w:rFonts w:ascii="Arial" w:hAnsi="Helvetica" w:eastAsia="Helvetica" w:cs="Helvetica"/>
-                      <w:i w:val="false"/>
-                      <w:b w:val="false"/>
-                      <w:u w:val="none"/>
-                      <w:strike w:val="false"/>
-                      <w:sz w:val="16"/>
-                      <w:szCs w:val="16"/>
-                      <w:color w:val="000000"/>
-                    </w:rPr>
-                    <w:t xml:space="preserve">Entrevistas y reuniones técnicas</w:t>
+                    <w:t xml:space="preserve">Mandato legal, capacidad de elaborar y modificar reglamentos, coordinación entre entidades</w:t>
                   </w:r>
                 </w:p>
               </w:tc>
@@ -8645,7 +8546,7 @@
                       <w:szCs w:val="16"/>
                       <w:color w:val="000000"/>
                     </w:rPr>
-                    <w:t xml:space="preserve">Sistema financiero</w:t>
+                    <w:t xml:space="preserve">Registrar</w:t>
                   </w:r>
                 </w:p>
               </w:tc>
@@ -8699,61 +8600,7 @@
                       <w:szCs w:val="16"/>
                       <w:color w:val="000000"/>
                     </w:rPr>
-                    <w:t xml:space="preserve">Banca pública y privada, fondos de inversión, superintendencias y proveedores de financiamiento sostenible</w:t>
-                  </w:r>
-                </w:p>
-              </w:tc>
-              <w:tc>
-                <w:tcPr>
-                  <w:tcBorders>
-                    <w:bottom w:val="none" w:sz="0" w:space="0" w:color="000000"/>
-                    <w:top w:val="none" w:sz="0" w:space="0" w:color="000000"/>
-                    <w:left w:val="none" w:sz="0" w:space="0" w:color="000000"/>
-                    <w:right w:val="none" w:sz="0" w:space="0" w:color="000000"/>
-                  </w:tcBorders>
-                  <w:shd w:val="clear" w:color="auto" w:fill="FFFFFF"/>
-                  <w:tcMar>
-                    <w:top w:w="0" w:type="dxa"/>
-                    <w:bottom w:w="0" w:type="dxa"/>
-                    <w:left w:w="0" w:type="dxa"/>
-                    <w:right w:w="0" w:type="dxa"/>
-                  </w:tcMar>
-                  <w:vAlign w:val="center"/>
-                </w:tcPr>
-                <w:p>
-                  <w:pPr>
-                    <w:jc w:val="left"/>
-                    <w:pBdr>
-                      <w:bottom w:val="none" w:sz="0" w:space="0" w:color="000000"/>
-                      <w:top w:val="none" w:sz="0" w:space="0" w:color="000000"/>
-                      <w:left w:val="none" w:sz="0" w:space="0" w:color="000000"/>
-                      <w:right w:val="none" w:sz="0" w:space="0" w:color="000000"/>
-                    </w:pBdr>
-                    <w:spacing w:after="60" w:before="60" w:line="240"/>
-                    <w:ind w:left="60" w:right="60" w:firstLine="0" w:firstLineChars="0"/>
-                    <w:rPr>
-                      <w:rFonts w:ascii="Arial" w:hAnsi="Helvetica" w:eastAsia="Helvetica" w:cs="Helvetica"/>
-                      <w:i w:val="false"/>
-                      <w:b w:val="false"/>
-                      <w:u w:val="none"/>
-                      <w:strike w:val="false"/>
-                      <w:sz w:val="16"/>
-                      <w:szCs w:val="16"/>
-                      <w:color w:val="000000"/>
-                    </w:rPr>
-                  </w:pPr>
-                  <w:r xmlns:w="http://schemas.openxmlformats.org/wordprocessingml/2006/main" xmlns:wp="http://schemas.openxmlformats.org/drawingml/2006/wordprocessingDrawing" xmlns:r="http://schemas.openxmlformats.org/officeDocument/2006/relationships" xmlns:w14="http://schemas.microsoft.com/office/word/2010/wordml">
-                    <w:rPr>
-                      <w:rFonts w:ascii="Arial" w:hAnsi="Helvetica" w:eastAsia="Helvetica" w:cs="Helvetica"/>
-                      <w:i w:val="false"/>
-                      <w:b w:val="false"/>
-                      <w:u w:val="none"/>
-                      <w:strike w:val="false"/>
-                      <w:sz w:val="16"/>
-                      <w:szCs w:val="16"/>
-                      <w:color w:val="000000"/>
-                    </w:rPr>
-                    <w:t xml:space="preserve">Entrevistas</w:t>
+                    <w:t xml:space="preserve">Registros de productores, importadores y gestores; interoperabilidad de datos</w:t>
                   </w:r>
                 </w:p>
               </w:tc>
@@ -8812,7 +8659,7 @@
                       <w:szCs w:val="16"/>
                       <w:color w:val="000000"/>
                     </w:rPr>
-                    <w:t xml:space="preserve">Sector privado</w:t>
+                    <w:t xml:space="preserve">Recaudar y administrar recursos</w:t>
                   </w:r>
                 </w:p>
               </w:tc>
@@ -8866,61 +8713,7 @@
                       <w:szCs w:val="16"/>
                       <w:color w:val="000000"/>
                     </w:rPr>
-                    <w:t xml:space="preserve">Gremios y empresas de los sectores de política, productores e importadores sujetos o potencialmente sujetos a REP, gestores y valorizadores de residuos</w:t>
-                  </w:r>
-                </w:p>
-              </w:tc>
-              <w:tc>
-                <w:tcPr>
-                  <w:tcBorders>
-                    <w:bottom w:val="none" w:sz="0" w:space="0" w:color="000000"/>
-                    <w:top w:val="none" w:sz="0" w:space="0" w:color="000000"/>
-                    <w:left w:val="none" w:sz="0" w:space="0" w:color="000000"/>
-                    <w:right w:val="none" w:sz="0" w:space="0" w:color="000000"/>
-                  </w:tcBorders>
-                  <w:shd w:val="clear" w:color="auto" w:fill="FFFFFF"/>
-                  <w:tcMar>
-                    <w:top w:w="0" w:type="dxa"/>
-                    <w:bottom w:w="0" w:type="dxa"/>
-                    <w:left w:w="0" w:type="dxa"/>
-                    <w:right w:w="0" w:type="dxa"/>
-                  </w:tcMar>
-                  <w:vAlign w:val="center"/>
-                </w:tcPr>
-                <w:p>
-                  <w:pPr>
-                    <w:jc w:val="left"/>
-                    <w:pBdr>
-                      <w:bottom w:val="none" w:sz="0" w:space="0" w:color="000000"/>
-                      <w:top w:val="none" w:sz="0" w:space="0" w:color="000000"/>
-                      <w:left w:val="none" w:sz="0" w:space="0" w:color="000000"/>
-                      <w:right w:val="none" w:sz="0" w:space="0" w:color="000000"/>
-                    </w:pBdr>
-                    <w:spacing w:after="60" w:before="60" w:line="240"/>
-                    <w:ind w:left="60" w:right="60" w:firstLine="0" w:firstLineChars="0"/>
-                    <w:rPr>
-                      <w:rFonts w:ascii="Arial" w:hAnsi="Helvetica" w:eastAsia="Helvetica" w:cs="Helvetica"/>
-                      <w:i w:val="false"/>
-                      <w:b w:val="false"/>
-                      <w:u w:val="none"/>
-                      <w:strike w:val="false"/>
-                      <w:sz w:val="16"/>
-                      <w:szCs w:val="16"/>
-                      <w:color w:val="000000"/>
-                    </w:rPr>
-                  </w:pPr>
-                  <w:r xmlns:w="http://schemas.openxmlformats.org/wordprocessingml/2006/main" xmlns:wp="http://schemas.openxmlformats.org/drawingml/2006/wordprocessingDrawing" xmlns:r="http://schemas.openxmlformats.org/officeDocument/2006/relationships" xmlns:w14="http://schemas.microsoft.com/office/word/2010/wordml">
-                    <w:rPr>
-                      <w:rFonts w:ascii="Arial" w:hAnsi="Helvetica" w:eastAsia="Helvetica" w:cs="Helvetica"/>
-                      <w:i w:val="false"/>
-                      <w:b w:val="false"/>
-                      <w:u w:val="none"/>
-                      <w:strike w:val="false"/>
-                      <w:sz w:val="16"/>
-                      <w:szCs w:val="16"/>
-                      <w:color w:val="000000"/>
-                    </w:rPr>
-                    <w:t xml:space="preserve">Entrevistas y mesa técnica</w:t>
+                    <w:t xml:space="preserve">Capacidad de recaudar tarifas o tributos, de custodiar fondos y de asignarlos</w:t>
                   </w:r>
                 </w:p>
               </w:tc>
@@ -8932,6 +8725,232 @@
               <w:tc>
                 <w:tcPr>
                   <w:tcBorders>
+                    <w:bottom w:val="none" w:sz="0" w:space="0" w:color="000000"/>
+                    <w:top w:val="none" w:sz="0" w:space="0" w:color="000000"/>
+                    <w:left w:val="none" w:sz="0" w:space="0" w:color="000000"/>
+                    <w:right w:val="none" w:sz="0" w:space="0" w:color="000000"/>
+                  </w:tcBorders>
+                  <w:shd w:val="clear" w:color="auto" w:fill="FFFFFF"/>
+                  <w:tcMar>
+                    <w:top w:w="0" w:type="dxa"/>
+                    <w:bottom w:w="0" w:type="dxa"/>
+                    <w:left w:w="0" w:type="dxa"/>
+                    <w:right w:w="0" w:type="dxa"/>
+                  </w:tcMar>
+                  <w:vAlign w:val="center"/>
+                </w:tcPr>
+                <w:p>
+                  <w:pPr>
+                    <w:jc w:val="left"/>
+                    <w:pBdr>
+                      <w:bottom w:val="none" w:sz="0" w:space="0" w:color="000000"/>
+                      <w:top w:val="none" w:sz="0" w:space="0" w:color="000000"/>
+                      <w:left w:val="none" w:sz="0" w:space="0" w:color="000000"/>
+                      <w:right w:val="none" w:sz="0" w:space="0" w:color="000000"/>
+                    </w:pBdr>
+                    <w:spacing w:after="60" w:before="60" w:line="240"/>
+                    <w:ind w:left="60" w:right="60" w:firstLine="0" w:firstLineChars="0"/>
+                    <w:rPr>
+                      <w:rFonts w:ascii="Arial" w:hAnsi="Helvetica" w:eastAsia="Helvetica" w:cs="Helvetica"/>
+                      <w:i w:val="false"/>
+                      <w:b w:val="false"/>
+                      <w:u w:val="none"/>
+                      <w:strike w:val="false"/>
+                      <w:sz w:val="16"/>
+                      <w:szCs w:val="16"/>
+                      <w:color w:val="000000"/>
+                    </w:rPr>
+                  </w:pPr>
+                  <w:r xmlns:w="http://schemas.openxmlformats.org/wordprocessingml/2006/main" xmlns:wp="http://schemas.openxmlformats.org/drawingml/2006/wordprocessingDrawing" xmlns:r="http://schemas.openxmlformats.org/officeDocument/2006/relationships" xmlns:w14="http://schemas.microsoft.com/office/word/2010/wordml">
+                    <w:rPr>
+                      <w:rFonts w:ascii="Arial" w:hAnsi="Helvetica" w:eastAsia="Helvetica" w:cs="Helvetica"/>
+                      <w:i w:val="false"/>
+                      <w:b w:val="false"/>
+                      <w:u w:val="none"/>
+                      <w:strike w:val="false"/>
+                      <w:sz w:val="16"/>
+                      <w:szCs w:val="16"/>
+                      <w:color w:val="000000"/>
+                    </w:rPr>
+                    <w:t xml:space="preserve">Controlar y fiscalizar</w:t>
+                  </w:r>
+                </w:p>
+              </w:tc>
+              <w:tc>
+                <w:tcPr>
+                  <w:tcBorders>
+                    <w:bottom w:val="none" w:sz="0" w:space="0" w:color="000000"/>
+                    <w:top w:val="none" w:sz="0" w:space="0" w:color="000000"/>
+                    <w:left w:val="none" w:sz="0" w:space="0" w:color="000000"/>
+                    <w:right w:val="none" w:sz="0" w:space="0" w:color="000000"/>
+                  </w:tcBorders>
+                  <w:shd w:val="clear" w:color="auto" w:fill="FFFFFF"/>
+                  <w:tcMar>
+                    <w:top w:w="0" w:type="dxa"/>
+                    <w:bottom w:w="0" w:type="dxa"/>
+                    <w:left w:w="0" w:type="dxa"/>
+                    <w:right w:w="0" w:type="dxa"/>
+                  </w:tcMar>
+                  <w:vAlign w:val="center"/>
+                </w:tcPr>
+                <w:p>
+                  <w:pPr>
+                    <w:jc w:val="left"/>
+                    <w:pBdr>
+                      <w:bottom w:val="none" w:sz="0" w:space="0" w:color="000000"/>
+                      <w:top w:val="none" w:sz="0" w:space="0" w:color="000000"/>
+                      <w:left w:val="none" w:sz="0" w:space="0" w:color="000000"/>
+                      <w:right w:val="none" w:sz="0" w:space="0" w:color="000000"/>
+                    </w:pBdr>
+                    <w:spacing w:after="60" w:before="60" w:line="240"/>
+                    <w:ind w:left="60" w:right="60" w:firstLine="0" w:firstLineChars="0"/>
+                    <w:rPr>
+                      <w:rFonts w:ascii="Arial" w:hAnsi="Helvetica" w:eastAsia="Helvetica" w:cs="Helvetica"/>
+                      <w:i w:val="false"/>
+                      <w:b w:val="false"/>
+                      <w:u w:val="none"/>
+                      <w:strike w:val="false"/>
+                      <w:sz w:val="16"/>
+                      <w:szCs w:val="16"/>
+                      <w:color w:val="000000"/>
+                    </w:rPr>
+                  </w:pPr>
+                  <w:r xmlns:w="http://schemas.openxmlformats.org/wordprocessingml/2006/main" xmlns:wp="http://schemas.openxmlformats.org/drawingml/2006/wordprocessingDrawing" xmlns:r="http://schemas.openxmlformats.org/officeDocument/2006/relationships" xmlns:w14="http://schemas.microsoft.com/office/word/2010/wordml">
+                    <w:rPr>
+                      <w:rFonts w:ascii="Arial" w:hAnsi="Helvetica" w:eastAsia="Helvetica" w:cs="Helvetica"/>
+                      <w:i w:val="false"/>
+                      <w:b w:val="false"/>
+                      <w:u w:val="none"/>
+                      <w:strike w:val="false"/>
+                      <w:sz w:val="16"/>
+                      <w:szCs w:val="16"/>
+                      <w:color w:val="000000"/>
+                    </w:rPr>
+                    <w:t xml:space="preserve">Inspección, auditoría de terceros, sanciones y capacidad aduanera</w:t>
+                  </w:r>
+                </w:p>
+              </w:tc>
+            </w:tr>
+            <w:tr>
+              <w:trPr>
+                <w:trHeight w:val="360" w:hRule="auto"/>
+              </w:trPr>
+              <w:tc>
+                <w:tcPr>
+                  <w:tcBorders>
+                    <w:bottom w:val="none" w:sz="0" w:space="0" w:color="000000"/>
+                    <w:top w:val="none" w:sz="0" w:space="0" w:color="000000"/>
+                    <w:left w:val="none" w:sz="0" w:space="0" w:color="000000"/>
+                    <w:right w:val="none" w:sz="0" w:space="0" w:color="000000"/>
+                  </w:tcBorders>
+                  <w:shd w:val="clear" w:color="auto" w:fill="FFFFFF"/>
+                  <w:tcMar>
+                    <w:top w:w="0" w:type="dxa"/>
+                    <w:bottom w:w="0" w:type="dxa"/>
+                    <w:left w:w="0" w:type="dxa"/>
+                    <w:right w:w="0" w:type="dxa"/>
+                  </w:tcMar>
+                  <w:vAlign w:val="center"/>
+                </w:tcPr>
+                <w:p>
+                  <w:pPr>
+                    <w:jc w:val="left"/>
+                    <w:pBdr>
+                      <w:bottom w:val="none" w:sz="0" w:space="0" w:color="000000"/>
+                      <w:top w:val="none" w:sz="0" w:space="0" w:color="000000"/>
+                      <w:left w:val="none" w:sz="0" w:space="0" w:color="000000"/>
+                      <w:right w:val="none" w:sz="0" w:space="0" w:color="000000"/>
+                    </w:pBdr>
+                    <w:spacing w:after="60" w:before="60" w:line="240"/>
+                    <w:ind w:left="60" w:right="60" w:firstLine="0" w:firstLineChars="0"/>
+                    <w:rPr>
+                      <w:rFonts w:ascii="Arial" w:hAnsi="Helvetica" w:eastAsia="Helvetica" w:cs="Helvetica"/>
+                      <w:i w:val="false"/>
+                      <w:b w:val="false"/>
+                      <w:u w:val="none"/>
+                      <w:strike w:val="false"/>
+                      <w:sz w:val="16"/>
+                      <w:szCs w:val="16"/>
+                      <w:color w:val="000000"/>
+                    </w:rPr>
+                  </w:pPr>
+                  <w:r xmlns:w="http://schemas.openxmlformats.org/wordprocessingml/2006/main" xmlns:wp="http://schemas.openxmlformats.org/drawingml/2006/wordprocessingDrawing" xmlns:r="http://schemas.openxmlformats.org/officeDocument/2006/relationships" xmlns:w14="http://schemas.microsoft.com/office/word/2010/wordml">
+                    <w:rPr>
+                      <w:rFonts w:ascii="Arial" w:hAnsi="Helvetica" w:eastAsia="Helvetica" w:cs="Helvetica"/>
+                      <w:i w:val="false"/>
+                      <w:b w:val="false"/>
+                      <w:u w:val="none"/>
+                      <w:strike w:val="false"/>
+                      <w:sz w:val="16"/>
+                      <w:szCs w:val="16"/>
+                      <w:color w:val="000000"/>
+                    </w:rPr>
+                    <w:t xml:space="preserve">Monitorear y reportar</w:t>
+                  </w:r>
+                </w:p>
+              </w:tc>
+              <w:tc>
+                <w:tcPr>
+                  <w:tcBorders>
+                    <w:bottom w:val="none" w:sz="0" w:space="0" w:color="000000"/>
+                    <w:top w:val="none" w:sz="0" w:space="0" w:color="000000"/>
+                    <w:left w:val="none" w:sz="0" w:space="0" w:color="000000"/>
+                    <w:right w:val="none" w:sz="0" w:space="0" w:color="000000"/>
+                  </w:tcBorders>
+                  <w:shd w:val="clear" w:color="auto" w:fill="FFFFFF"/>
+                  <w:tcMar>
+                    <w:top w:w="0" w:type="dxa"/>
+                    <w:bottom w:w="0" w:type="dxa"/>
+                    <w:left w:w="0" w:type="dxa"/>
+                    <w:right w:w="0" w:type="dxa"/>
+                  </w:tcMar>
+                  <w:vAlign w:val="center"/>
+                </w:tcPr>
+                <w:p>
+                  <w:pPr>
+                    <w:jc w:val="left"/>
+                    <w:pBdr>
+                      <w:bottom w:val="none" w:sz="0" w:space="0" w:color="000000"/>
+                      <w:top w:val="none" w:sz="0" w:space="0" w:color="000000"/>
+                      <w:left w:val="none" w:sz="0" w:space="0" w:color="000000"/>
+                      <w:right w:val="none" w:sz="0" w:space="0" w:color="000000"/>
+                    </w:pBdr>
+                    <w:spacing w:after="60" w:before="60" w:line="240"/>
+                    <w:ind w:left="60" w:right="60" w:firstLine="0" w:firstLineChars="0"/>
+                    <w:rPr>
+                      <w:rFonts w:ascii="Arial" w:hAnsi="Helvetica" w:eastAsia="Helvetica" w:cs="Helvetica"/>
+                      <w:i w:val="false"/>
+                      <w:b w:val="false"/>
+                      <w:u w:val="none"/>
+                      <w:strike w:val="false"/>
+                      <w:sz w:val="16"/>
+                      <w:szCs w:val="16"/>
+                      <w:color w:val="000000"/>
+                    </w:rPr>
+                  </w:pPr>
+                  <w:r xmlns:w="http://schemas.openxmlformats.org/wordprocessingml/2006/main" xmlns:wp="http://schemas.openxmlformats.org/drawingml/2006/wordprocessingDrawing" xmlns:r="http://schemas.openxmlformats.org/officeDocument/2006/relationships" xmlns:w14="http://schemas.microsoft.com/office/word/2010/wordml">
+                    <w:rPr>
+                      <w:rFonts w:ascii="Arial" w:hAnsi="Helvetica" w:eastAsia="Helvetica" w:cs="Helvetica"/>
+                      <w:i w:val="false"/>
+                      <w:b w:val="false"/>
+                      <w:u w:val="none"/>
+                      <w:strike w:val="false"/>
+                      <w:sz w:val="16"/>
+                      <w:szCs w:val="16"/>
+                      <w:color w:val="000000"/>
+                    </w:rPr>
+                    <w:t xml:space="preserve">Indicadores, plataforma de información y reportes periódicos</w:t>
+                  </w:r>
+                </w:p>
+              </w:tc>
+            </w:tr>
+            <w:tr>
+              <w:trPr>
+                <w:trHeight w:val="360" w:hRule="auto"/>
+              </w:trPr>
+              <w:tc>
+                <w:tcPr>
+                  <w:tcBorders>
                     <w:bottom w:val="single" w:sz="12" w:space="0" w:color="666666"/>
                     <w:top w:val="none" w:sz="0" w:space="0" w:color="000000"/>
                     <w:left w:val="none" w:sz="0" w:space="0" w:color="000000"/>
@@ -8979,7 +8998,7 @@
                       <w:szCs w:val="16"/>
                       <w:color w:val="000000"/>
                     </w:rPr>
-                    <w:t xml:space="preserve">Academia y sociedad civil</w:t>
+                    <w:t xml:space="preserve">Financiar</w:t>
                   </w:r>
                 </w:p>
               </w:tc>
@@ -9033,67 +9052,13 @@
                       <w:szCs w:val="16"/>
                       <w:color w:val="000000"/>
                     </w:rPr>
-                    <w:t xml:space="preserve">Centros técnicos, universidades y organizaciones con experiencia en circularidad y gestión de residuos</w:t>
-                  </w:r>
-                </w:p>
-              </w:tc>
-              <w:tc>
-                <w:tcPr>
-                  <w:tcBorders>
-                    <w:bottom w:val="single" w:sz="12" w:space="0" w:color="666666"/>
-                    <w:top w:val="none" w:sz="0" w:space="0" w:color="000000"/>
-                    <w:left w:val="none" w:sz="0" w:space="0" w:color="000000"/>
-                    <w:right w:val="none" w:sz="0" w:space="0" w:color="000000"/>
-                  </w:tcBorders>
-                  <w:shd w:val="clear" w:color="auto" w:fill="FFFFFF"/>
-                  <w:tcMar>
-                    <w:top w:w="0" w:type="dxa"/>
-                    <w:bottom w:w="0" w:type="dxa"/>
-                    <w:left w:w="0" w:type="dxa"/>
-                    <w:right w:w="0" w:type="dxa"/>
-                  </w:tcMar>
-                  <w:vAlign w:val="center"/>
-                </w:tcPr>
-                <w:p>
-                  <w:pPr>
-                    <w:jc w:val="left"/>
-                    <w:pBdr>
-                      <w:bottom w:val="none" w:sz="0" w:space="0" w:color="000000"/>
-                      <w:top w:val="none" w:sz="0" w:space="0" w:color="000000"/>
-                      <w:left w:val="none" w:sz="0" w:space="0" w:color="000000"/>
-                      <w:right w:val="none" w:sz="0" w:space="0" w:color="000000"/>
-                    </w:pBdr>
-                    <w:spacing w:after="60" w:before="60" w:line="240"/>
-                    <w:ind w:left="60" w:right="60" w:firstLine="0" w:firstLineChars="0"/>
-                    <w:rPr>
-                      <w:rFonts w:ascii="Arial" w:hAnsi="Helvetica" w:eastAsia="Helvetica" w:cs="Helvetica"/>
-                      <w:i w:val="false"/>
-                      <w:b w:val="false"/>
-                      <w:u w:val="none"/>
-                      <w:strike w:val="false"/>
-                      <w:sz w:val="16"/>
-                      <w:szCs w:val="16"/>
-                      <w:color w:val="000000"/>
-                    </w:rPr>
-                  </w:pPr>
-                  <w:r xmlns:w="http://schemas.openxmlformats.org/wordprocessingml/2006/main" xmlns:wp="http://schemas.openxmlformats.org/drawingml/2006/wordprocessingDrawing" xmlns:r="http://schemas.openxmlformats.org/officeDocument/2006/relationships" xmlns:w14="http://schemas.microsoft.com/office/word/2010/wordml">
-                    <w:rPr>
-                      <w:rFonts w:ascii="Arial" w:hAnsi="Helvetica" w:eastAsia="Helvetica" w:cs="Helvetica"/>
-                      <w:i w:val="false"/>
-                      <w:b w:val="false"/>
-                      <w:u w:val="none"/>
-                      <w:strike w:val="false"/>
-                      <w:sz w:val="16"/>
-                      <w:szCs w:val="16"/>
-                      <w:color w:val="000000"/>
-                    </w:rPr>
-                    <w:t xml:space="preserve">Entrevistas y mesa técnica</w:t>
+                    <w:t xml:space="preserve">Productos financieros, evaluación de riesgo de proyectos circulares y bancabilidad</w:t>
                   </w:r>
                 </w:p>
               </w:tc>
             </w:tr>
           </w:tbl>
-          <w:bookmarkEnd w:id="61"/>
+          <w:bookmarkEnd w:id="53"/>
           <w:p/>
         </w:tc>
       </w:tr>
@@ -9110,22 +9075,107 @@
         <w:t xml:space="preserve">Fuente: elaboración propia.</w:t>
       </w:r>
     </w:p>
+    <w:bookmarkEnd w:id="54"/>
+    <w:bookmarkStart w:id="55" w:name="análisis-del-sistema-financiero"/>
     <w:p>
       <w:pPr>
-        <w:pStyle w:val="BodyText"/>
-      </w:pPr>
-      <w:r>
-        <w:t xml:space="preserve">La mesa técnica de validación, con participación del sector público, privado, académico y de la sociedad civil, presenta la propuesta de la Actividad 3. Sus aportes se sistematizan en un documento que registra qué se recibió, qué se incorporó y por qué se descartó lo demás.</w:t>
+        <w:pStyle w:val="Heading2"/>
+      </w:pPr>
+      <w:r>
+        <w:t xml:space="preserve">7.6 Análisis del sistema financiero</w:t>
       </w:r>
     </w:p>
-    <w:bookmarkEnd w:id="62"/>
-    <w:bookmarkStart w:id="63" w:name="limitaciones-del-enfoque"/>
     <w:p>
       <w:pPr>
+        <w:pStyle w:val="FirstParagraph"/>
+      </w:pPr>
+      <w:r>
+        <w:t xml:space="preserve">El análisis del sistema financiero mapea los actores (banca pública y privada, fondos de inversión, aseguradoras, mercado de valores, financiamiento verde y otras fuentes de financiamiento sostenible), los instrumentos que ofrecen y las barreras que enfrentan los proyectos circulares. Se articula con la taxonomía de finanzas sostenibles</w:t>
+      </w:r>
+      <w:r>
+        <w:t xml:space="preserve"> </w:t>
+      </w:r>
+      <w:r>
+        <w:t xml:space="preserve">(Superintendencia de Bancos de Panamá et al., 2024)</w:t>
+      </w:r>
+      <w:r>
+        <w:t xml:space="preserve"> </w:t>
+      </w:r>
+      <w:r>
+        <w:t xml:space="preserve">y con el marco soberano de financiamiento sostenible</w:t>
+      </w:r>
+      <w:r>
+        <w:t xml:space="preserve"> </w:t>
+      </w:r>
+      <w:r>
+        <w:t xml:space="preserve">(Ministerio de Economía y Finanzas de Panamá, 2024)</w:t>
+      </w:r>
+      <w:r>
+        <w:t xml:space="preserve">. El aporte diferenciado es cerrar la brecha entre lo que la taxonomía define como elegible y la demanda real de proyectos circulares financiables.</w:t>
+      </w:r>
+    </w:p>
+    <w:bookmarkEnd w:id="55"/>
+    <w:bookmarkEnd w:id="56"/>
+    <w:bookmarkStart w:id="60" w:name="X400ac7d34e5c8d1bb0e2d8c345760bdd51cb73f"/>
+    <w:p>
+      <w:pPr>
         <w:pStyle w:val="Heading1"/>
       </w:pPr>
       <w:r>
-        <w:t xml:space="preserve">11. Limitaciones del enfoque</w:t>
+        <w:t xml:space="preserve">8. Metodología de la Actividad 3: Hoja de Ruta</w:t>
+      </w:r>
+    </w:p>
+    <w:bookmarkStart w:id="57" w:name="qué-se-busca-y-producto-2"/>
+    <w:p>
+      <w:pPr>
+        <w:pStyle w:val="Heading2"/>
+      </w:pPr>
+      <w:r>
+        <w:t xml:space="preserve">8.1 Qué se busca y producto</w:t>
+      </w:r>
+    </w:p>
+    <w:p>
+      <w:pPr>
+        <w:pStyle w:val="FirstParagraph"/>
+      </w:pPr>
+      <w:r>
+        <w:t xml:space="preserve">La Actividad 3 busca convertir los instrumentos que superen la evaluación de la Actividad 2 en una Hoja de Ruta Nacional para el Financiamiento de la Economía Circular, que MiAMBIENTE y el Consejo puedan usar en la implementación de la Ley 502. Para ello se diseña cada instrumento con sus montos, metas, responsables y plazos, se definen los actores y sus roles, se identifican las fuentes de financiamiento y las reformas necesarias, y se validan los resultados con actores del sector público, el sistema financiero, el sector privado, la academia y la sociedad civil. Su producto es el tercer informe.</w:t>
+      </w:r>
+    </w:p>
+    <w:bookmarkEnd w:id="57"/>
+    <w:bookmarkStart w:id="58" w:name="contenido-de-la-hoja-de-ruta"/>
+    <w:p>
+      <w:pPr>
+        <w:pStyle w:val="Heading2"/>
+      </w:pPr>
+      <w:r>
+        <w:t xml:space="preserve">8.2 Contenido de la Hoja de Ruta</w:t>
+      </w:r>
+    </w:p>
+    <w:p>
+      <w:pPr>
+        <w:pStyle w:val="FirstParagraph"/>
+      </w:pPr>
+      <w:r>
+        <w:t xml:space="preserve">El contenido de la Hoja de Ruta es: el diseño de los instrumentos financieros aplicables a la realidad nacional, incluidos los modelos de REP; los actores responsables y sus roles en la implementación, el seguimiento y la evaluación; el mapeo de fuentes de financiamiento nacionales e internacionales, públicas y privadas; las reformas normativas, regulatorias o institucionales requeridas; los indicadores de seguimiento y evaluación; y la articulación con la Ley 502 y otros instrumentos nacionales.</w:t>
+      </w:r>
+    </w:p>
+    <w:bookmarkEnd w:id="58"/>
+    <w:bookmarkStart w:id="59" w:name="reglas-para-ordenar-las-recomendaciones"/>
+    <w:p>
+      <w:pPr>
+        <w:pStyle w:val="Heading2"/>
+      </w:pPr>
+      <w:r>
+        <w:t xml:space="preserve">8.3 Reglas para ordenar las recomendaciones</w:t>
+      </w:r>
+    </w:p>
+    <w:p>
+      <w:pPr>
+        <w:pStyle w:val="FirstParagraph"/>
+      </w:pPr>
+      <w:r>
+        <w:t xml:space="preserve">Para ordenar las recomendaciones se aplican tres reglas:</w:t>
       </w:r>
     </w:p>
     <w:p>
@@ -9133,7 +9183,7 @@
         <w:pStyle w:val="Compact"/>
         <w:numPr>
           <w:ilvl w:val="0"/>
-          <w:numId w:val="1006"/>
+          <w:numId w:val="1005"/>
         </w:numPr>
       </w:pPr>
       <w:r>
@@ -9141,13 +9191,13 @@
           <w:b/>
           <w:bCs/>
         </w:rPr>
-        <w:t xml:space="preserve">Alcance de los datos.</w:t>
+        <w:t xml:space="preserve">Secuencia en dos pasos.</w:t>
       </w:r>
       <w:r>
         <w:t xml:space="preserve"> </w:t>
       </w:r>
       <w:r>
-        <w:t xml:space="preserve">Varios criterios solo se pueden evaluar a nivel de sección económica o con supuestos de asignación. El análisis sectorial detalla las brechas.</w:t>
+        <w:t xml:space="preserve">Primero los instrumentos habilitantes (registro, trazabilidad, capacidad institucional) y después los que dependen de ellos, como tarifas, impuestos y metas.</w:t>
       </w:r>
     </w:p>
     <w:p>
@@ -9155,7 +9205,7 @@
         <w:pStyle w:val="Compact"/>
         <w:numPr>
           <w:ilvl w:val="0"/>
-          <w:numId w:val="1006"/>
+          <w:numId w:val="1005"/>
         </w:numPr>
       </w:pPr>
       <w:r>
@@ -9163,13 +9213,13 @@
           <w:b/>
           <w:bCs/>
         </w:rPr>
-        <w:t xml:space="preserve">Año de la matriz.</w:t>
+        <w:t xml:space="preserve">Utilización de la institucionalidad existente.</w:t>
       </w:r>
       <w:r>
         <w:t xml:space="preserve"> </w:t>
       </w:r>
       <w:r>
-        <w:t xml:space="preserve">Los eslabonamientos son de 2018 y suponen coeficientes estables.</w:t>
+        <w:t xml:space="preserve">Se prefieren los mecanismos que se apoyan en instrumentos ya vigentes, como los incentivos del Ministerio de Comercio e Industrias, la taxonomía y el marco soberano de financiamiento, antes que crear instrumentos nuevos.</w:t>
       </w:r>
     </w:p>
     <w:p>
@@ -9177,7 +9227,7 @@
         <w:pStyle w:val="Compact"/>
         <w:numPr>
           <w:ilvl w:val="0"/>
-          <w:numId w:val="1006"/>
+          <w:numId w:val="1005"/>
         </w:numPr>
       </w:pPr>
       <w:r>
@@ -9185,67 +9235,148 @@
           <w:b/>
           <w:bCs/>
         </w:rPr>
-        <w:t xml:space="preserve">Sectores de política.</w:t>
+        <w:t xml:space="preserve">Trazabilidad de cada recomendación.</w:t>
       </w:r>
       <w:r>
         <w:t xml:space="preserve"> </w:t>
       </w:r>
       <w:r>
-        <w:t xml:space="preserve">La equivalencia entre sectores y actividades es un trabajo de la consultoría y requiere validación.</w:t>
+        <w:t xml:space="preserve">Cada recomendación se rastrea hasta una fuente, un criterio de selección y una necesidad institucional o de mercado identificada.</w:t>
       </w:r>
     </w:p>
     <w:p>
       <w:pPr>
-        <w:pStyle w:val="Compact"/>
-        <w:numPr>
-          <w:ilvl w:val="0"/>
-          <w:numId w:val="1006"/>
-        </w:numPr>
-      </w:pPr>
-      <w:r>
-        <w:rPr>
-          <w:b/>
-          <w:bCs/>
-        </w:rPr>
-        <w:t xml:space="preserve">Evidencia internacional.</w:t>
+        <w:pStyle w:val="FirstParagraph"/>
+      </w:pPr>
+      <w:r>
+        <w:t xml:space="preserve">Los indicadores de seguimiento se diseñan en coordinación con la plataforma de indicadores que ordena la Ley 502</w:t>
       </w:r>
       <w:r>
         <w:t xml:space="preserve"> </w:t>
       </w:r>
       <w:r>
-        <w:t xml:space="preserve">Las evaluaciones de efectos son más abundantes para algunos instrumentos (bolsas plásticas, depósito y reembolso, vertedero) que para otros (REP, ecomodulación), y su transferencia a Panamá depende del contexto.</w:t>
+        <w:t xml:space="preserve">(Asamblea Nacional de Panamá, 2025, art. 11)</w:t>
+      </w:r>
+      <w:r>
+        <w:t xml:space="preserve">, para que sirvan al seguimiento de la ley y de los instrumentos que se desarrollen en su marco.</w:t>
+      </w:r>
+    </w:p>
+    <w:bookmarkEnd w:id="59"/>
+    <w:bookmarkEnd w:id="60"/>
+    <w:bookmarkStart w:id="65" w:name="estrategia-de-datos-y-control-de-calidad"/>
+    <w:p>
+      <w:pPr>
+        <w:pStyle w:val="Heading1"/>
+      </w:pPr>
+      <w:r>
+        <w:t xml:space="preserve">9. Estrategia de datos y control de calidad</w:t>
+      </w:r>
+    </w:p>
+    <w:bookmarkStart w:id="61" w:name="principios"/>
+    <w:p>
+      <w:pPr>
+        <w:pStyle w:val="Heading2"/>
+      </w:pPr>
+      <w:r>
+        <w:t xml:space="preserve">9.1 Principios</w:t>
       </w:r>
     </w:p>
     <w:p>
       <w:pPr>
-        <w:pStyle w:val="Compact"/>
-        <w:numPr>
-          <w:ilvl w:val="0"/>
-          <w:numId w:val="1006"/>
-        </w:numPr>
-      </w:pPr>
-      <w:r>
-        <w:rPr>
-          <w:b/>
-          <w:bCs/>
-        </w:rPr>
-        <w:t xml:space="preserve">Efectos de los instrumentos.</w:t>
-      </w:r>
-      <w:r>
-        <w:t xml:space="preserve"> </w:t>
-      </w:r>
-      <w:r>
-        <w:t xml:space="preserve">El análisis cuantitativo usa un modelo de precios con traslado completo, que es una aproximación. No incluye cambios de comportamiento de los consumidores ni de los productores.</w:t>
+        <w:pStyle w:val="FirstParagraph"/>
+      </w:pPr>
+      <w:r>
+        <w:t xml:space="preserve">La estrategia de datos sigue un orden de preferencia: primero información oficial nacional, luego fuentes internacionales comparables y por último proxies o evidencia cualitativa cuando hay vacíos. Toda cifra utilizada proviene de una base de datos construida por la consultoría, y cada base tiene una memoria de cálculo pública que documenta los pasos en código, de modo que pueden auditarse y reproducirse. Las memorias cubren la equivalencia de sectores, las cuentas por actividad, el empleo, los eslabonamientos, las emisiones, los recursos y residuos, la inversión y la estructura empresarial, y la síntesis sectorial.</w:t>
+      </w:r>
+    </w:p>
+    <w:bookmarkEnd w:id="61"/>
+    <w:bookmarkStart w:id="62" w:name="registro-de-brechas"/>
+    <w:p>
+      <w:pPr>
+        <w:pStyle w:val="Heading2"/>
+      </w:pPr>
+      <w:r>
+        <w:t xml:space="preserve">9.2 Registro de brechas</w:t>
+      </w:r>
+    </w:p>
+    <w:p>
+      <w:pPr>
+        <w:pStyle w:val="FirstParagraph"/>
+      </w:pPr>
+      <w:r>
+        <w:t xml:space="preserve">La consultoría mantiene un registro de vacíos de información y de las decisiones que se tomaron para suplirlos. Las brechas más relevantes son la ausencia de cuotas de mercado, de datos sobre recicladores de base y de series anuales de residuos. Cada brecha se traduce en una solicitud de información por las vías formales, con la contraparte, y en un tratamiento alternativo documentado. La coordinación con la consultoría de sistema de información e indicadores del programa evita duplicar solicitudes.</w:t>
+      </w:r>
+    </w:p>
+    <w:bookmarkEnd w:id="62"/>
+    <w:bookmarkStart w:id="63" w:name="reproducibilidad"/>
+    <w:p>
+      <w:pPr>
+        <w:pStyle w:val="Heading2"/>
+      </w:pPr>
+      <w:r>
+        <w:t xml:space="preserve">9.3 Reproducibilidad</w:t>
+      </w:r>
+    </w:p>
+    <w:p>
+      <w:pPr>
+        <w:pStyle w:val="FirstParagraph"/>
+      </w:pPr>
+      <w:r>
+        <w:t xml:space="preserve">Los cálculos se hacen en un solo lenguaje de programación (R) y con rutas relativas al proyecto, de modo que quien tenga los datos de origen puede regenerar las bases. El código se versiona y las bases de resultados se exportan en formatos abiertos y editables. La bibliografía de cada documento se arma a partir de una bibliografía maestra con las fuentes verificadas.</w:t>
       </w:r>
     </w:p>
     <w:bookmarkEnd w:id="63"/>
-    <w:bookmarkStart w:id="65" w:name="glosario-de-siglas"/>
+    <w:bookmarkStart w:id="64" w:name="X8c49f04d0b51d6c1fb8c41cdc27788e2b3bf87c"/>
     <w:p>
       <w:pPr>
+        <w:pStyle w:val="Heading2"/>
+      </w:pPr>
+      <w:r>
+        <w:t xml:space="preserve">9.4 Tratamiento de la evidencia internacional</w:t>
+      </w:r>
+    </w:p>
+    <w:p>
+      <w:pPr>
+        <w:pStyle w:val="FirstParagraph"/>
+      </w:pPr>
+      <w:r>
+        <w:t xml:space="preserve">La evidencia sobre instrumentos proviene de leyes, informes técnicos de instituciones y estudios de acceso abierto. Cada dato lleva su fuente y página. Lo que no se pudo leer en el original, por ejemplo cuando un sitio bloqueó la descarga, se marca como no verificado y no se usa como base de recomendaciones.</w:t>
+      </w:r>
+    </w:p>
+    <w:bookmarkEnd w:id="64"/>
+    <w:bookmarkEnd w:id="65"/>
+    <w:bookmarkStart w:id="67" w:name="participación-de-actores"/>
+    <w:p>
+      <w:pPr>
         <w:pStyle w:val="Heading1"/>
       </w:pPr>
       <w:r>
-        <w:t xml:space="preserve">Glosario de siglas</w:t>
+        <w:t xml:space="preserve">10. Participación de actores</w:t>
+      </w:r>
+    </w:p>
+    <w:p>
+      <w:pPr>
+        <w:pStyle w:val="FirstParagraph"/>
+      </w:pPr>
+      <w:r>
+        <w:t xml:space="preserve">La participación no se limita a la mesa técnica de validación final. Se realizan entrevistas semiestructuradas y reuniones técnicas durante el desarrollo de las actividades, para completar vacíos de datos, probar la factibilidad, identificar incentivos y anticipar cuellos de botella. La</w:t>
+      </w:r>
+      <w:r>
+        <w:t xml:space="preserve"> </w:t>
+      </w:r>
+      <w:hyperlink w:anchor="tbl-actores">
+        <w:r>
+          <w:rPr>
+            <w:rStyle w:val="Hyperlink"/>
+          </w:rPr>
+          <w:t xml:space="preserve">Cuadro 8</w:t>
+        </w:r>
+      </w:hyperlink>
+      <w:r>
+        <w:t xml:space="preserve"> </w:t>
+      </w:r>
+      <w:r>
+        <w:t xml:space="preserve">resume los grupos y su propósito.</w:t>
       </w:r>
     </w:p>
     <w:tbl>
@@ -9261,7 +9392,7 @@
       <w:tr>
         <w:tc>
           <w:tcPr/>
-          <w:bookmarkStart w:id="64" w:name="tbl-siglas"/>
+          <w:bookmarkStart w:id="66" w:name="tbl-actores"/>
           <w:p>
             <w:pPr>
               <w:pStyle w:val="ImageCaption"/>
@@ -9269,7 +9400,7 @@
               <w:jc w:val="left"/>
             </w:pPr>
             <w:r>
-              <w:t xml:space="preserve">Cuadro 8: Glosario de siglas</w:t>
+              <w:t xml:space="preserve">Cuadro 8: Grupos de actores y mecanismos de consulta</w:t>
             </w:r>
           </w:p>
           <w:tbl xmlns:w="http://schemas.openxmlformats.org/wordprocessingml/2006/main" xmlns:r="http://schemas.openxmlformats.org/officeDocument/2006/relationships" xmlns:w14="http://schemas.microsoft.com/office/word/2010/wordml" xmlns:wp="http://schemas.openxmlformats.org/drawingml/2006/wordprocessingDrawing" xmlns:a="http://schemas.openxmlformats.org/drawingml/2006/main" xmlns:pic="http://schemas.openxmlformats.org/drawingml/2006/picture">
@@ -9334,7 +9465,7 @@
                       <w:szCs w:val="16"/>
                       <w:color w:val="000000"/>
                     </w:rPr>
-                    <w:t xml:space="preserve">Sigla</w:t>
+                    <w:t xml:space="preserve">Grupo</w:t>
                   </w:r>
                 </w:p>
               </w:tc>
@@ -9388,7 +9519,61 @@
                       <w:szCs w:val="16"/>
                       <w:color w:val="000000"/>
                     </w:rPr>
-                    <w:t xml:space="preserve">Significado</w:t>
+                    <w:t xml:space="preserve">Propósito de la consulta</w:t>
+                  </w:r>
+                </w:p>
+              </w:tc>
+              <w:tc>
+                <w:tcPr>
+                  <w:tcBorders>
+                    <w:bottom w:val="single" w:sz="12" w:space="0" w:color="666666"/>
+                    <w:top w:val="single" w:sz="12" w:space="0" w:color="666666"/>
+                    <w:left w:val="none" w:sz="0" w:space="0" w:color="000000"/>
+                    <w:right w:val="none" w:sz="0" w:space="0" w:color="000000"/>
+                  </w:tcBorders>
+                  <w:shd w:val="clear" w:color="auto" w:fill="FFFFFF"/>
+                  <w:tcMar>
+                    <w:top w:w="0" w:type="dxa"/>
+                    <w:bottom w:w="0" w:type="dxa"/>
+                    <w:left w:w="0" w:type="dxa"/>
+                    <w:right w:w="0" w:type="dxa"/>
+                  </w:tcMar>
+                  <w:vAlign w:val="center"/>
+                </w:tcPr>
+                <w:p>
+                  <w:pPr>
+                    <w:jc w:val="left"/>
+                    <w:pBdr>
+                      <w:bottom w:val="none" w:sz="0" w:space="0" w:color="000000"/>
+                      <w:top w:val="none" w:sz="0" w:space="0" w:color="000000"/>
+                      <w:left w:val="none" w:sz="0" w:space="0" w:color="000000"/>
+                      <w:right w:val="none" w:sz="0" w:space="0" w:color="000000"/>
+                    </w:pBdr>
+                    <w:spacing w:after="60" w:before="60" w:line="240"/>
+                    <w:ind w:left="60" w:right="60" w:firstLine="0" w:firstLineChars="0"/>
+                    <w:rPr>
+                      <w:rFonts w:ascii="Arial" w:hAnsi="Helvetica" w:eastAsia="Helvetica" w:cs="Helvetica"/>
+                      <w:i w:val="false"/>
+                      <w:b w:val="false"/>
+                      <w:u w:val="none"/>
+                      <w:strike w:val="false"/>
+                      <w:sz w:val="16"/>
+                      <w:szCs w:val="16"/>
+                      <w:color w:val="000000"/>
+                    </w:rPr>
+                  </w:pPr>
+                  <w:r xmlns:w="http://schemas.openxmlformats.org/wordprocessingml/2006/main" xmlns:wp="http://schemas.openxmlformats.org/drawingml/2006/wordprocessingDrawing" xmlns:r="http://schemas.openxmlformats.org/officeDocument/2006/relationships" xmlns:w14="http://schemas.microsoft.com/office/word/2010/wordml">
+                    <w:rPr>
+                      <w:rFonts w:ascii="Arial" w:hAnsi="Helvetica" w:eastAsia="Helvetica" w:cs="Helvetica"/>
+                      <w:i w:val="false"/>
+                      <w:b w:val="false"/>
+                      <w:u w:val="none"/>
+                      <w:strike w:val="false"/>
+                      <w:sz w:val="16"/>
+                      <w:szCs w:val="16"/>
+                      <w:color w:val="000000"/>
+                    </w:rPr>
+                    <w:t xml:space="preserve">Mecanismo</w:t>
                   </w:r>
                 </w:p>
               </w:tc>
@@ -9447,7 +9632,7 @@
                       <w:szCs w:val="16"/>
                       <w:color w:val="000000"/>
                     </w:rPr>
-                    <w:t xml:space="preserve">CEPAL</w:t>
+                    <w:t xml:space="preserve">Gobierno</w:t>
                   </w:r>
                 </w:p>
               </w:tc>
@@ -9501,7 +9686,61 @@
                       <w:szCs w:val="16"/>
                       <w:color w:val="000000"/>
                     </w:rPr>
-                    <w:t xml:space="preserve">Comisión Económica para América Latina y el Caribe</w:t>
+                    <w:t xml:space="preserve">MiAMBIENTE y entidades con competencias económicas, financieras, productivas, comerciales, tributarias, municipales y de gestión de residuos; el Ministerio de Economía y Finanzas, incluida la Dirección de Crédito Público</w:t>
+                  </w:r>
+                </w:p>
+              </w:tc>
+              <w:tc>
+                <w:tcPr>
+                  <w:tcBorders>
+                    <w:bottom w:val="none" w:sz="0" w:space="0" w:color="000000"/>
+                    <w:top w:val="single" w:sz="12" w:space="0" w:color="666666"/>
+                    <w:left w:val="none" w:sz="0" w:space="0" w:color="000000"/>
+                    <w:right w:val="none" w:sz="0" w:space="0" w:color="000000"/>
+                  </w:tcBorders>
+                  <w:shd w:val="clear" w:color="auto" w:fill="FFFFFF"/>
+                  <w:tcMar>
+                    <w:top w:w="0" w:type="dxa"/>
+                    <w:bottom w:w="0" w:type="dxa"/>
+                    <w:left w:w="0" w:type="dxa"/>
+                    <w:right w:w="0" w:type="dxa"/>
+                  </w:tcMar>
+                  <w:vAlign w:val="center"/>
+                </w:tcPr>
+                <w:p>
+                  <w:pPr>
+                    <w:jc w:val="left"/>
+                    <w:pBdr>
+                      <w:bottom w:val="none" w:sz="0" w:space="0" w:color="000000"/>
+                      <w:top w:val="none" w:sz="0" w:space="0" w:color="000000"/>
+                      <w:left w:val="none" w:sz="0" w:space="0" w:color="000000"/>
+                      <w:right w:val="none" w:sz="0" w:space="0" w:color="000000"/>
+                    </w:pBdr>
+                    <w:spacing w:after="60" w:before="60" w:line="240"/>
+                    <w:ind w:left="60" w:right="60" w:firstLine="0" w:firstLineChars="0"/>
+                    <w:rPr>
+                      <w:rFonts w:ascii="Arial" w:hAnsi="Helvetica" w:eastAsia="Helvetica" w:cs="Helvetica"/>
+                      <w:i w:val="false"/>
+                      <w:b w:val="false"/>
+                      <w:u w:val="none"/>
+                      <w:strike w:val="false"/>
+                      <w:sz w:val="16"/>
+                      <w:szCs w:val="16"/>
+                      <w:color w:val="000000"/>
+                    </w:rPr>
+                  </w:pPr>
+                  <w:r xmlns:w="http://schemas.openxmlformats.org/wordprocessingml/2006/main" xmlns:wp="http://schemas.openxmlformats.org/drawingml/2006/wordprocessingDrawing" xmlns:r="http://schemas.openxmlformats.org/officeDocument/2006/relationships" xmlns:w14="http://schemas.microsoft.com/office/word/2010/wordml">
+                    <w:rPr>
+                      <w:rFonts w:ascii="Arial" w:hAnsi="Helvetica" w:eastAsia="Helvetica" w:cs="Helvetica"/>
+                      <w:i w:val="false"/>
+                      <w:b w:val="false"/>
+                      <w:u w:val="none"/>
+                      <w:strike w:val="false"/>
+                      <w:sz w:val="16"/>
+                      <w:szCs w:val="16"/>
+                      <w:color w:val="000000"/>
+                    </w:rPr>
+                    <w:t xml:space="preserve">Entrevistas y reuniones técnicas</w:t>
                   </w:r>
                 </w:p>
               </w:tc>
@@ -9560,7 +9799,7 @@
                       <w:szCs w:val="16"/>
                       <w:color w:val="000000"/>
                     </w:rPr>
-                    <w:t xml:space="preserve">EDGAR</w:t>
+                    <w:t xml:space="preserve">Sistema financiero</w:t>
                   </w:r>
                 </w:p>
               </w:tc>
@@ -9614,7 +9853,61 @@
                       <w:szCs w:val="16"/>
                       <w:color w:val="000000"/>
                     </w:rPr>
-                    <w:t xml:space="preserve">Base de datos de emisiones para la investigación atmosférica global (Emissions Database for Global Atmospheric Research)</w:t>
+                    <w:t xml:space="preserve">Banca pública y privada, fondos de inversión, superintendencias y proveedores de financiamiento sostenible</w:t>
+                  </w:r>
+                </w:p>
+              </w:tc>
+              <w:tc>
+                <w:tcPr>
+                  <w:tcBorders>
+                    <w:bottom w:val="none" w:sz="0" w:space="0" w:color="000000"/>
+                    <w:top w:val="none" w:sz="0" w:space="0" w:color="000000"/>
+                    <w:left w:val="none" w:sz="0" w:space="0" w:color="000000"/>
+                    <w:right w:val="none" w:sz="0" w:space="0" w:color="000000"/>
+                  </w:tcBorders>
+                  <w:shd w:val="clear" w:color="auto" w:fill="FFFFFF"/>
+                  <w:tcMar>
+                    <w:top w:w="0" w:type="dxa"/>
+                    <w:bottom w:w="0" w:type="dxa"/>
+                    <w:left w:w="0" w:type="dxa"/>
+                    <w:right w:w="0" w:type="dxa"/>
+                  </w:tcMar>
+                  <w:vAlign w:val="center"/>
+                </w:tcPr>
+                <w:p>
+                  <w:pPr>
+                    <w:jc w:val="left"/>
+                    <w:pBdr>
+                      <w:bottom w:val="none" w:sz="0" w:space="0" w:color="000000"/>
+                      <w:top w:val="none" w:sz="0" w:space="0" w:color="000000"/>
+                      <w:left w:val="none" w:sz="0" w:space="0" w:color="000000"/>
+                      <w:right w:val="none" w:sz="0" w:space="0" w:color="000000"/>
+                    </w:pBdr>
+                    <w:spacing w:after="60" w:before="60" w:line="240"/>
+                    <w:ind w:left="60" w:right="60" w:firstLine="0" w:firstLineChars="0"/>
+                    <w:rPr>
+                      <w:rFonts w:ascii="Arial" w:hAnsi="Helvetica" w:eastAsia="Helvetica" w:cs="Helvetica"/>
+                      <w:i w:val="false"/>
+                      <w:b w:val="false"/>
+                      <w:u w:val="none"/>
+                      <w:strike w:val="false"/>
+                      <w:sz w:val="16"/>
+                      <w:szCs w:val="16"/>
+                      <w:color w:val="000000"/>
+                    </w:rPr>
+                  </w:pPr>
+                  <w:r xmlns:w="http://schemas.openxmlformats.org/wordprocessingml/2006/main" xmlns:wp="http://schemas.openxmlformats.org/drawingml/2006/wordprocessingDrawing" xmlns:r="http://schemas.openxmlformats.org/officeDocument/2006/relationships" xmlns:w14="http://schemas.microsoft.com/office/word/2010/wordml">
+                    <w:rPr>
+                      <w:rFonts w:ascii="Arial" w:hAnsi="Helvetica" w:eastAsia="Helvetica" w:cs="Helvetica"/>
+                      <w:i w:val="false"/>
+                      <w:b w:val="false"/>
+                      <w:u w:val="none"/>
+                      <w:strike w:val="false"/>
+                      <w:sz w:val="16"/>
+                      <w:szCs w:val="16"/>
+                      <w:color w:val="000000"/>
+                    </w:rPr>
+                    <w:t xml:space="preserve">Entrevistas</w:t>
                   </w:r>
                 </w:p>
               </w:tc>
@@ -9673,7 +9966,7 @@
                       <w:szCs w:val="16"/>
                       <w:color w:val="000000"/>
                     </w:rPr>
-                    <w:t xml:space="preserve">GIZ</w:t>
+                    <w:t xml:space="preserve">Sector privado</w:t>
                   </w:r>
                 </w:p>
               </w:tc>
@@ -9727,7 +10020,61 @@
                       <w:szCs w:val="16"/>
                       <w:color w:val="000000"/>
                     </w:rPr>
-                    <w:t xml:space="preserve">Agencia Alemana de Cooperación Internacional</w:t>
+                    <w:t xml:space="preserve">Gremios y empresas de los sectores de política, productores e importadores sujetos o potencialmente sujetos a REP, gestores y valorizadores de residuos</w:t>
+                  </w:r>
+                </w:p>
+              </w:tc>
+              <w:tc>
+                <w:tcPr>
+                  <w:tcBorders>
+                    <w:bottom w:val="none" w:sz="0" w:space="0" w:color="000000"/>
+                    <w:top w:val="none" w:sz="0" w:space="0" w:color="000000"/>
+                    <w:left w:val="none" w:sz="0" w:space="0" w:color="000000"/>
+                    <w:right w:val="none" w:sz="0" w:space="0" w:color="000000"/>
+                  </w:tcBorders>
+                  <w:shd w:val="clear" w:color="auto" w:fill="FFFFFF"/>
+                  <w:tcMar>
+                    <w:top w:w="0" w:type="dxa"/>
+                    <w:bottom w:w="0" w:type="dxa"/>
+                    <w:left w:w="0" w:type="dxa"/>
+                    <w:right w:w="0" w:type="dxa"/>
+                  </w:tcMar>
+                  <w:vAlign w:val="center"/>
+                </w:tcPr>
+                <w:p>
+                  <w:pPr>
+                    <w:jc w:val="left"/>
+                    <w:pBdr>
+                      <w:bottom w:val="none" w:sz="0" w:space="0" w:color="000000"/>
+                      <w:top w:val="none" w:sz="0" w:space="0" w:color="000000"/>
+                      <w:left w:val="none" w:sz="0" w:space="0" w:color="000000"/>
+                      <w:right w:val="none" w:sz="0" w:space="0" w:color="000000"/>
+                    </w:pBdr>
+                    <w:spacing w:after="60" w:before="60" w:line="240"/>
+                    <w:ind w:left="60" w:right="60" w:firstLine="0" w:firstLineChars="0"/>
+                    <w:rPr>
+                      <w:rFonts w:ascii="Arial" w:hAnsi="Helvetica" w:eastAsia="Helvetica" w:cs="Helvetica"/>
+                      <w:i w:val="false"/>
+                      <w:b w:val="false"/>
+                      <w:u w:val="none"/>
+                      <w:strike w:val="false"/>
+                      <w:sz w:val="16"/>
+                      <w:szCs w:val="16"/>
+                      <w:color w:val="000000"/>
+                    </w:rPr>
+                  </w:pPr>
+                  <w:r xmlns:w="http://schemas.openxmlformats.org/wordprocessingml/2006/main" xmlns:wp="http://schemas.openxmlformats.org/drawingml/2006/wordprocessingDrawing" xmlns:r="http://schemas.openxmlformats.org/officeDocument/2006/relationships" xmlns:w14="http://schemas.microsoft.com/office/word/2010/wordml">
+                    <w:rPr>
+                      <w:rFonts w:ascii="Arial" w:hAnsi="Helvetica" w:eastAsia="Helvetica" w:cs="Helvetica"/>
+                      <w:i w:val="false"/>
+                      <w:b w:val="false"/>
+                      <w:u w:val="none"/>
+                      <w:strike w:val="false"/>
+                      <w:sz w:val="16"/>
+                      <w:szCs w:val="16"/>
+                      <w:color w:val="000000"/>
+                    </w:rPr>
+                    <w:t xml:space="preserve">Entrevistas y mesa técnica</w:t>
                   </w:r>
                 </w:p>
               </w:tc>
@@ -9739,7 +10086,7 @@
               <w:tc>
                 <w:tcPr>
                   <w:tcBorders>
-                    <w:bottom w:val="none" w:sz="0" w:space="0" w:color="000000"/>
+                    <w:bottom w:val="single" w:sz="12" w:space="0" w:color="666666"/>
                     <w:top w:val="none" w:sz="0" w:space="0" w:color="000000"/>
                     <w:left w:val="none" w:sz="0" w:space="0" w:color="000000"/>
                     <w:right w:val="none" w:sz="0" w:space="0" w:color="000000"/>
@@ -9786,14 +10133,14 @@
                       <w:szCs w:val="16"/>
                       <w:color w:val="000000"/>
                     </w:rPr>
-                    <w:t xml:space="preserve">IED</w:t>
-                  </w:r>
-                </w:p>
-              </w:tc>
-              <w:tc>
-                <w:tcPr>
-                  <w:tcBorders>
-                    <w:bottom w:val="none" w:sz="0" w:space="0" w:color="000000"/>
+                    <w:t xml:space="preserve">Academia y sociedad civil</w:t>
+                  </w:r>
+                </w:p>
+              </w:tc>
+              <w:tc>
+                <w:tcPr>
+                  <w:tcBorders>
+                    <w:bottom w:val="single" w:sz="12" w:space="0" w:color="666666"/>
                     <w:top w:val="none" w:sz="0" w:space="0" w:color="000000"/>
                     <w:left w:val="none" w:sz="0" w:space="0" w:color="000000"/>
                     <w:right w:val="none" w:sz="0" w:space="0" w:color="000000"/>
@@ -9840,7 +10187,362 @@
                       <w:szCs w:val="16"/>
                       <w:color w:val="000000"/>
                     </w:rPr>
-                    <w:t xml:space="preserve">Inversión extranjera directa</w:t>
+                    <w:t xml:space="preserve">Centros técnicos, universidades y organizaciones con experiencia en circularidad y gestión de residuos</w:t>
+                  </w:r>
+                </w:p>
+              </w:tc>
+              <w:tc>
+                <w:tcPr>
+                  <w:tcBorders>
+                    <w:bottom w:val="single" w:sz="12" w:space="0" w:color="666666"/>
+                    <w:top w:val="none" w:sz="0" w:space="0" w:color="000000"/>
+                    <w:left w:val="none" w:sz="0" w:space="0" w:color="000000"/>
+                    <w:right w:val="none" w:sz="0" w:space="0" w:color="000000"/>
+                  </w:tcBorders>
+                  <w:shd w:val="clear" w:color="auto" w:fill="FFFFFF"/>
+                  <w:tcMar>
+                    <w:top w:w="0" w:type="dxa"/>
+                    <w:bottom w:w="0" w:type="dxa"/>
+                    <w:left w:w="0" w:type="dxa"/>
+                    <w:right w:w="0" w:type="dxa"/>
+                  </w:tcMar>
+                  <w:vAlign w:val="center"/>
+                </w:tcPr>
+                <w:p>
+                  <w:pPr>
+                    <w:jc w:val="left"/>
+                    <w:pBdr>
+                      <w:bottom w:val="none" w:sz="0" w:space="0" w:color="000000"/>
+                      <w:top w:val="none" w:sz="0" w:space="0" w:color="000000"/>
+                      <w:left w:val="none" w:sz="0" w:space="0" w:color="000000"/>
+                      <w:right w:val="none" w:sz="0" w:space="0" w:color="000000"/>
+                    </w:pBdr>
+                    <w:spacing w:after="60" w:before="60" w:line="240"/>
+                    <w:ind w:left="60" w:right="60" w:firstLine="0" w:firstLineChars="0"/>
+                    <w:rPr>
+                      <w:rFonts w:ascii="Arial" w:hAnsi="Helvetica" w:eastAsia="Helvetica" w:cs="Helvetica"/>
+                      <w:i w:val="false"/>
+                      <w:b w:val="false"/>
+                      <w:u w:val="none"/>
+                      <w:strike w:val="false"/>
+                      <w:sz w:val="16"/>
+                      <w:szCs w:val="16"/>
+                      <w:color w:val="000000"/>
+                    </w:rPr>
+                  </w:pPr>
+                  <w:r xmlns:w="http://schemas.openxmlformats.org/wordprocessingml/2006/main" xmlns:wp="http://schemas.openxmlformats.org/drawingml/2006/wordprocessingDrawing" xmlns:r="http://schemas.openxmlformats.org/officeDocument/2006/relationships" xmlns:w14="http://schemas.microsoft.com/office/word/2010/wordml">
+                    <w:rPr>
+                      <w:rFonts w:ascii="Arial" w:hAnsi="Helvetica" w:eastAsia="Helvetica" w:cs="Helvetica"/>
+                      <w:i w:val="false"/>
+                      <w:b w:val="false"/>
+                      <w:u w:val="none"/>
+                      <w:strike w:val="false"/>
+                      <w:sz w:val="16"/>
+                      <w:szCs w:val="16"/>
+                      <w:color w:val="000000"/>
+                    </w:rPr>
+                    <w:t xml:space="preserve">Entrevistas y mesa técnica</w:t>
+                  </w:r>
+                </w:p>
+              </w:tc>
+            </w:tr>
+          </w:tbl>
+          <w:bookmarkEnd w:id="66"/>
+          <w:p/>
+        </w:tc>
+      </w:tr>
+    </w:tbl>
+    <w:p>
+      <w:pPr>
+        <w:pStyle w:val="BodyText"/>
+      </w:pPr>
+      <w:r>
+        <w:rPr>
+          <w:i/>
+          <w:iCs/>
+        </w:rPr>
+        <w:t xml:space="preserve">Fuente: elaboración propia.</w:t>
+      </w:r>
+    </w:p>
+    <w:p>
+      <w:pPr>
+        <w:pStyle w:val="BodyText"/>
+      </w:pPr>
+      <w:r>
+        <w:t xml:space="preserve">La mesa técnica de validación, con participación del sector público, privado, académico y de la sociedad civil, presenta la propuesta de la Actividad 3. Sus aportes se sistematizan en un documento que registra qué se recibió, qué se incorporó y por qué se descartó lo demás.</w:t>
+      </w:r>
+    </w:p>
+    <w:bookmarkEnd w:id="67"/>
+    <w:bookmarkStart w:id="68" w:name="limitaciones-del-enfoque"/>
+    <w:p>
+      <w:pPr>
+        <w:pStyle w:val="Heading1"/>
+      </w:pPr>
+      <w:r>
+        <w:t xml:space="preserve">11. Limitaciones del enfoque</w:t>
+      </w:r>
+    </w:p>
+    <w:p>
+      <w:pPr>
+        <w:pStyle w:val="Compact"/>
+        <w:numPr>
+          <w:ilvl w:val="0"/>
+          <w:numId w:val="1006"/>
+        </w:numPr>
+      </w:pPr>
+      <w:r>
+        <w:rPr>
+          <w:b/>
+          <w:bCs/>
+        </w:rPr>
+        <w:t xml:space="preserve">Alcance de los datos.</w:t>
+      </w:r>
+      <w:r>
+        <w:t xml:space="preserve"> </w:t>
+      </w:r>
+      <w:r>
+        <w:t xml:space="preserve">Varios criterios solo se pueden evaluar a nivel de sección económica o con supuestos de asignación. El análisis sectorial detalla las brechas.</w:t>
+      </w:r>
+    </w:p>
+    <w:p>
+      <w:pPr>
+        <w:pStyle w:val="Compact"/>
+        <w:numPr>
+          <w:ilvl w:val="0"/>
+          <w:numId w:val="1006"/>
+        </w:numPr>
+      </w:pPr>
+      <w:r>
+        <w:rPr>
+          <w:b/>
+          <w:bCs/>
+        </w:rPr>
+        <w:t xml:space="preserve">Año de la matriz.</w:t>
+      </w:r>
+      <w:r>
+        <w:t xml:space="preserve"> </w:t>
+      </w:r>
+      <w:r>
+        <w:t xml:space="preserve">Los eslabonamientos son de 2018 y suponen coeficientes estables.</w:t>
+      </w:r>
+    </w:p>
+    <w:p>
+      <w:pPr>
+        <w:pStyle w:val="Compact"/>
+        <w:numPr>
+          <w:ilvl w:val="0"/>
+          <w:numId w:val="1006"/>
+        </w:numPr>
+      </w:pPr>
+      <w:r>
+        <w:rPr>
+          <w:b/>
+          <w:bCs/>
+        </w:rPr>
+        <w:t xml:space="preserve">Sectores de política.</w:t>
+      </w:r>
+      <w:r>
+        <w:t xml:space="preserve"> </w:t>
+      </w:r>
+      <w:r>
+        <w:t xml:space="preserve">La equivalencia entre sectores y actividades es un trabajo de la consultoría y requiere validación.</w:t>
+      </w:r>
+    </w:p>
+    <w:p>
+      <w:pPr>
+        <w:pStyle w:val="Compact"/>
+        <w:numPr>
+          <w:ilvl w:val="0"/>
+          <w:numId w:val="1006"/>
+        </w:numPr>
+      </w:pPr>
+      <w:r>
+        <w:rPr>
+          <w:b/>
+          <w:bCs/>
+        </w:rPr>
+        <w:t xml:space="preserve">Evidencia internacional.</w:t>
+      </w:r>
+      <w:r>
+        <w:t xml:space="preserve"> </w:t>
+      </w:r>
+      <w:r>
+        <w:t xml:space="preserve">Las evaluaciones de efectos son más abundantes para algunos instrumentos (bolsas plásticas, depósito y reembolso, vertedero) que para otros (REP, ecomodulación), y su transferencia a Panamá depende del contexto.</w:t>
+      </w:r>
+    </w:p>
+    <w:p>
+      <w:pPr>
+        <w:pStyle w:val="Compact"/>
+        <w:numPr>
+          <w:ilvl w:val="0"/>
+          <w:numId w:val="1006"/>
+        </w:numPr>
+      </w:pPr>
+      <w:r>
+        <w:rPr>
+          <w:b/>
+          <w:bCs/>
+        </w:rPr>
+        <w:t xml:space="preserve">Efectos de los instrumentos.</w:t>
+      </w:r>
+      <w:r>
+        <w:t xml:space="preserve"> </w:t>
+      </w:r>
+      <w:r>
+        <w:t xml:space="preserve">El análisis cuantitativo usa un modelo de precios con traslado completo, que es una aproximación. No incluye cambios de comportamiento de los consumidores ni de los productores.</w:t>
+      </w:r>
+    </w:p>
+    <w:bookmarkEnd w:id="68"/>
+    <w:bookmarkStart w:id="70" w:name="glosario-de-siglas"/>
+    <w:p>
+      <w:pPr>
+        <w:pStyle w:val="Heading1"/>
+      </w:pPr>
+      <w:r>
+        <w:t xml:space="preserve">Glosario de siglas</w:t>
+      </w:r>
+    </w:p>
+    <w:tbl>
+      <w:tblPr>
+        <w:tblStyle w:val="Table"/>
+        <w:tblW w:type="pct" w:w="5000"/>
+        <w:tblLayout w:type="fixed"/>
+        <w:tblLook w:firstRow="0" w:lastRow="0" w:firstColumn="0" w:lastColumn="0" w:noHBand="0" w:noVBand="0" w:val="0000"/>
+      </w:tblPr>
+      <w:tblGrid>
+        <w:gridCol w:w="7920"/>
+      </w:tblGrid>
+      <w:tr>
+        <w:tc>
+          <w:tcPr/>
+          <w:bookmarkStart w:id="69" w:name="tbl-siglas"/>
+          <w:p>
+            <w:pPr>
+              <w:pStyle w:val="ImageCaption"/>
+              <w:spacing w:before="200"/>
+              <w:jc w:val="left"/>
+            </w:pPr>
+            <w:r>
+              <w:t xml:space="preserve">Cuadro 9: Glosario de siglas</w:t>
+            </w:r>
+          </w:p>
+          <w:tbl xmlns:w="http://schemas.openxmlformats.org/wordprocessingml/2006/main" xmlns:r="http://schemas.openxmlformats.org/officeDocument/2006/relationships" xmlns:w14="http://schemas.microsoft.com/office/word/2010/wordml" xmlns:wp="http://schemas.openxmlformats.org/drawingml/2006/wordprocessingDrawing" xmlns:a="http://schemas.openxmlformats.org/drawingml/2006/main" xmlns:pic="http://schemas.openxmlformats.org/drawingml/2006/picture">
+            <w:tblPr>
+              <w:tblLayout w:type="autofit"/>
+              <w:jc w:val="center"/>
+              <w:tblW w:type="pct" w:w="5000"/>
+              <w:tblLook w:firstRow="1" w:lastRow="0" w:firstColumn="0" w:lastColumn="0" w:noHBand="0" w:noVBand="1"/>
+            </w:tblPr>
+            <w:tr>
+              <w:trPr>
+                <w:trHeight w:val="360" w:hRule="auto"/>
+                <w:tblHeader/>
+              </w:trPr>
+              <w:tc>
+                <w:tcPr>
+                  <w:tcBorders>
+                    <w:bottom w:val="single" w:sz="12" w:space="0" w:color="666666"/>
+                    <w:top w:val="single" w:sz="12" w:space="0" w:color="666666"/>
+                    <w:left w:val="none" w:sz="0" w:space="0" w:color="000000"/>
+                    <w:right w:val="none" w:sz="0" w:space="0" w:color="000000"/>
+                  </w:tcBorders>
+                  <w:shd w:val="clear" w:color="auto" w:fill="FFFFFF"/>
+                  <w:tcMar>
+                    <w:top w:w="0" w:type="dxa"/>
+                    <w:bottom w:w="0" w:type="dxa"/>
+                    <w:left w:w="0" w:type="dxa"/>
+                    <w:right w:w="0" w:type="dxa"/>
+                  </w:tcMar>
+                  <w:vAlign w:val="center"/>
+                </w:tcPr>
+                <w:p>
+                  <w:pPr>
+                    <w:jc w:val="left"/>
+                    <w:pBdr>
+                      <w:bottom w:val="none" w:sz="0" w:space="0" w:color="000000"/>
+                      <w:top w:val="none" w:sz="0" w:space="0" w:color="000000"/>
+                      <w:left w:val="none" w:sz="0" w:space="0" w:color="000000"/>
+                      <w:right w:val="none" w:sz="0" w:space="0" w:color="000000"/>
+                    </w:pBdr>
+                    <w:spacing w:after="60" w:before="60" w:line="240"/>
+                    <w:ind w:left="60" w:right="60" w:firstLine="0" w:firstLineChars="0"/>
+                    <w:rPr>
+                      <w:rFonts w:ascii="Arial" w:hAnsi="Helvetica" w:eastAsia="Helvetica" w:cs="Helvetica"/>
+                      <w:i w:val="false"/>
+                      <w:b w:val="false"/>
+                      <w:u w:val="none"/>
+                      <w:strike w:val="false"/>
+                      <w:sz w:val="16"/>
+                      <w:szCs w:val="16"/>
+                      <w:color w:val="000000"/>
+                    </w:rPr>
+                  </w:pPr>
+                  <w:r xmlns:w="http://schemas.openxmlformats.org/wordprocessingml/2006/main" xmlns:wp="http://schemas.openxmlformats.org/drawingml/2006/wordprocessingDrawing" xmlns:r="http://schemas.openxmlformats.org/officeDocument/2006/relationships" xmlns:w14="http://schemas.microsoft.com/office/word/2010/wordml">
+                    <w:rPr>
+                      <w:rFonts w:ascii="Arial" w:hAnsi="Helvetica" w:eastAsia="Helvetica" w:cs="Helvetica"/>
+                      <w:i w:val="false"/>
+                      <w:b w:val="false"/>
+                      <w:u w:val="none"/>
+                      <w:strike w:val="false"/>
+                      <w:sz w:val="16"/>
+                      <w:szCs w:val="16"/>
+                      <w:color w:val="000000"/>
+                    </w:rPr>
+                    <w:t xml:space="preserve">Sigla</w:t>
+                  </w:r>
+                </w:p>
+              </w:tc>
+              <w:tc>
+                <w:tcPr>
+                  <w:tcBorders>
+                    <w:bottom w:val="single" w:sz="12" w:space="0" w:color="666666"/>
+                    <w:top w:val="single" w:sz="12" w:space="0" w:color="666666"/>
+                    <w:left w:val="none" w:sz="0" w:space="0" w:color="000000"/>
+                    <w:right w:val="none" w:sz="0" w:space="0" w:color="000000"/>
+                  </w:tcBorders>
+                  <w:shd w:val="clear" w:color="auto" w:fill="FFFFFF"/>
+                  <w:tcMar>
+                    <w:top w:w="0" w:type="dxa"/>
+                    <w:bottom w:w="0" w:type="dxa"/>
+                    <w:left w:w="0" w:type="dxa"/>
+                    <w:right w:w="0" w:type="dxa"/>
+                  </w:tcMar>
+                  <w:vAlign w:val="center"/>
+                </w:tcPr>
+                <w:p>
+                  <w:pPr>
+                    <w:jc w:val="left"/>
+                    <w:pBdr>
+                      <w:bottom w:val="none" w:sz="0" w:space="0" w:color="000000"/>
+                      <w:top w:val="none" w:sz="0" w:space="0" w:color="000000"/>
+                      <w:left w:val="none" w:sz="0" w:space="0" w:color="000000"/>
+                      <w:right w:val="none" w:sz="0" w:space="0" w:color="000000"/>
+                    </w:pBdr>
+                    <w:spacing w:after="60" w:before="60" w:line="240"/>
+                    <w:ind w:left="60" w:right="60" w:firstLine="0" w:firstLineChars="0"/>
+                    <w:rPr>
+                      <w:rFonts w:ascii="Arial" w:hAnsi="Helvetica" w:eastAsia="Helvetica" w:cs="Helvetica"/>
+                      <w:i w:val="false"/>
+                      <w:b w:val="false"/>
+                      <w:u w:val="none"/>
+                      <w:strike w:val="false"/>
+                      <w:sz w:val="16"/>
+                      <w:szCs w:val="16"/>
+                      <w:color w:val="000000"/>
+                    </w:rPr>
+                  </w:pPr>
+                  <w:r xmlns:w="http://schemas.openxmlformats.org/wordprocessingml/2006/main" xmlns:wp="http://schemas.openxmlformats.org/drawingml/2006/wordprocessingDrawing" xmlns:r="http://schemas.openxmlformats.org/officeDocument/2006/relationships" xmlns:w14="http://schemas.microsoft.com/office/word/2010/wordml">
+                    <w:rPr>
+                      <w:rFonts w:ascii="Arial" w:hAnsi="Helvetica" w:eastAsia="Helvetica" w:cs="Helvetica"/>
+                      <w:i w:val="false"/>
+                      <w:b w:val="false"/>
+                      <w:u w:val="none"/>
+                      <w:strike w:val="false"/>
+                      <w:sz w:val="16"/>
+                      <w:szCs w:val="16"/>
+                      <w:color w:val="000000"/>
+                    </w:rPr>
+                    <w:t xml:space="preserve">Significado</w:t>
                   </w:r>
                 </w:p>
               </w:tc>
@@ -9853,53 +10555,53 @@
                 <w:tcPr>
                   <w:tcBorders>
                     <w:bottom w:val="none" w:sz="0" w:space="0" w:color="000000"/>
-                    <w:top w:val="none" w:sz="0" w:space="0" w:color="000000"/>
-                    <w:left w:val="none" w:sz="0" w:space="0" w:color="000000"/>
-                    <w:right w:val="none" w:sz="0" w:space="0" w:color="000000"/>
-                  </w:tcBorders>
-                  <w:shd w:val="clear" w:color="auto" w:fill="FFFFFF"/>
-                  <w:tcMar>
-                    <w:top w:w="0" w:type="dxa"/>
-                    <w:bottom w:w="0" w:type="dxa"/>
-                    <w:left w:w="0" w:type="dxa"/>
-                    <w:right w:w="0" w:type="dxa"/>
-                  </w:tcMar>
-                  <w:vAlign w:val="center"/>
-                </w:tcPr>
-                <w:p>
-                  <w:pPr>
-                    <w:jc w:val="left"/>
-                    <w:pBdr>
-                      <w:bottom w:val="none" w:sz="0" w:space="0" w:color="000000"/>
-                      <w:top w:val="none" w:sz="0" w:space="0" w:color="000000"/>
-                      <w:left w:val="none" w:sz="0" w:space="0" w:color="000000"/>
-                      <w:right w:val="none" w:sz="0" w:space="0" w:color="000000"/>
-                    </w:pBdr>
-                    <w:spacing w:after="60" w:before="60" w:line="240"/>
-                    <w:ind w:left="60" w:right="60" w:firstLine="0" w:firstLineChars="0"/>
-                    <w:rPr>
-                      <w:rFonts w:ascii="Arial" w:hAnsi="Helvetica" w:eastAsia="Helvetica" w:cs="Helvetica"/>
-                      <w:i w:val="false"/>
-                      <w:b w:val="false"/>
-                      <w:u w:val="none"/>
-                      <w:strike w:val="false"/>
-                      <w:sz w:val="16"/>
-                      <w:szCs w:val="16"/>
-                      <w:color w:val="000000"/>
-                    </w:rPr>
-                  </w:pPr>
-                  <w:r xmlns:w="http://schemas.openxmlformats.org/wordprocessingml/2006/main" xmlns:wp="http://schemas.openxmlformats.org/drawingml/2006/wordprocessingDrawing" xmlns:r="http://schemas.openxmlformats.org/officeDocument/2006/relationships" xmlns:w14="http://schemas.microsoft.com/office/word/2010/wordml">
-                    <w:rPr>
-                      <w:rFonts w:ascii="Arial" w:hAnsi="Helvetica" w:eastAsia="Helvetica" w:cs="Helvetica"/>
-                      <w:i w:val="false"/>
-                      <w:b w:val="false"/>
-                      <w:u w:val="none"/>
-                      <w:strike w:val="false"/>
-                      <w:sz w:val="16"/>
-                      <w:szCs w:val="16"/>
-                      <w:color w:val="000000"/>
-                    </w:rPr>
-                    <w:t xml:space="preserve">INEC</w:t>
+                    <w:top w:val="single" w:sz="12" w:space="0" w:color="666666"/>
+                    <w:left w:val="none" w:sz="0" w:space="0" w:color="000000"/>
+                    <w:right w:val="none" w:sz="0" w:space="0" w:color="000000"/>
+                  </w:tcBorders>
+                  <w:shd w:val="clear" w:color="auto" w:fill="FFFFFF"/>
+                  <w:tcMar>
+                    <w:top w:w="0" w:type="dxa"/>
+                    <w:bottom w:w="0" w:type="dxa"/>
+                    <w:left w:w="0" w:type="dxa"/>
+                    <w:right w:w="0" w:type="dxa"/>
+                  </w:tcMar>
+                  <w:vAlign w:val="center"/>
+                </w:tcPr>
+                <w:p>
+                  <w:pPr>
+                    <w:jc w:val="left"/>
+                    <w:pBdr>
+                      <w:bottom w:val="none" w:sz="0" w:space="0" w:color="000000"/>
+                      <w:top w:val="none" w:sz="0" w:space="0" w:color="000000"/>
+                      <w:left w:val="none" w:sz="0" w:space="0" w:color="000000"/>
+                      <w:right w:val="none" w:sz="0" w:space="0" w:color="000000"/>
+                    </w:pBdr>
+                    <w:spacing w:after="60" w:before="60" w:line="240"/>
+                    <w:ind w:left="60" w:right="60" w:firstLine="0" w:firstLineChars="0"/>
+                    <w:rPr>
+                      <w:rFonts w:ascii="Arial" w:hAnsi="Helvetica" w:eastAsia="Helvetica" w:cs="Helvetica"/>
+                      <w:i w:val="false"/>
+                      <w:b w:val="false"/>
+                      <w:u w:val="none"/>
+                      <w:strike w:val="false"/>
+                      <w:sz w:val="16"/>
+                      <w:szCs w:val="16"/>
+                      <w:color w:val="000000"/>
+                    </w:rPr>
+                  </w:pPr>
+                  <w:r xmlns:w="http://schemas.openxmlformats.org/wordprocessingml/2006/main" xmlns:wp="http://schemas.openxmlformats.org/drawingml/2006/wordprocessingDrawing" xmlns:r="http://schemas.openxmlformats.org/officeDocument/2006/relationships" xmlns:w14="http://schemas.microsoft.com/office/word/2010/wordml">
+                    <w:rPr>
+                      <w:rFonts w:ascii="Arial" w:hAnsi="Helvetica" w:eastAsia="Helvetica" w:cs="Helvetica"/>
+                      <w:i w:val="false"/>
+                      <w:b w:val="false"/>
+                      <w:u w:val="none"/>
+                      <w:strike w:val="false"/>
+                      <w:sz w:val="16"/>
+                      <w:szCs w:val="16"/>
+                      <w:color w:val="000000"/>
+                    </w:rPr>
+                    <w:t xml:space="preserve">CEPAL</w:t>
                   </w:r>
                 </w:p>
               </w:tc>
@@ -9907,53 +10609,53 @@
                 <w:tcPr>
                   <w:tcBorders>
                     <w:bottom w:val="none" w:sz="0" w:space="0" w:color="000000"/>
-                    <w:top w:val="none" w:sz="0" w:space="0" w:color="000000"/>
-                    <w:left w:val="none" w:sz="0" w:space="0" w:color="000000"/>
-                    <w:right w:val="none" w:sz="0" w:space="0" w:color="000000"/>
-                  </w:tcBorders>
-                  <w:shd w:val="clear" w:color="auto" w:fill="FFFFFF"/>
-                  <w:tcMar>
-                    <w:top w:w="0" w:type="dxa"/>
-                    <w:bottom w:w="0" w:type="dxa"/>
-                    <w:left w:w="0" w:type="dxa"/>
-                    <w:right w:w="0" w:type="dxa"/>
-                  </w:tcMar>
-                  <w:vAlign w:val="center"/>
-                </w:tcPr>
-                <w:p>
-                  <w:pPr>
-                    <w:jc w:val="left"/>
-                    <w:pBdr>
-                      <w:bottom w:val="none" w:sz="0" w:space="0" w:color="000000"/>
-                      <w:top w:val="none" w:sz="0" w:space="0" w:color="000000"/>
-                      <w:left w:val="none" w:sz="0" w:space="0" w:color="000000"/>
-                      <w:right w:val="none" w:sz="0" w:space="0" w:color="000000"/>
-                    </w:pBdr>
-                    <w:spacing w:after="60" w:before="60" w:line="240"/>
-                    <w:ind w:left="60" w:right="60" w:firstLine="0" w:firstLineChars="0"/>
-                    <w:rPr>
-                      <w:rFonts w:ascii="Arial" w:hAnsi="Helvetica" w:eastAsia="Helvetica" w:cs="Helvetica"/>
-                      <w:i w:val="false"/>
-                      <w:b w:val="false"/>
-                      <w:u w:val="none"/>
-                      <w:strike w:val="false"/>
-                      <w:sz w:val="16"/>
-                      <w:szCs w:val="16"/>
-                      <w:color w:val="000000"/>
-                    </w:rPr>
-                  </w:pPr>
-                  <w:r xmlns:w="http://schemas.openxmlformats.org/wordprocessingml/2006/main" xmlns:wp="http://schemas.openxmlformats.org/drawingml/2006/wordprocessingDrawing" xmlns:r="http://schemas.openxmlformats.org/officeDocument/2006/relationships" xmlns:w14="http://schemas.microsoft.com/office/word/2010/wordml">
-                    <w:rPr>
-                      <w:rFonts w:ascii="Arial" w:hAnsi="Helvetica" w:eastAsia="Helvetica" w:cs="Helvetica"/>
-                      <w:i w:val="false"/>
-                      <w:b w:val="false"/>
-                      <w:u w:val="none"/>
-                      <w:strike w:val="false"/>
-                      <w:sz w:val="16"/>
-                      <w:szCs w:val="16"/>
-                      <w:color w:val="000000"/>
-                    </w:rPr>
-                    <w:t xml:space="preserve">Instituto Nacional de Estadística y Censo</w:t>
+                    <w:top w:val="single" w:sz="12" w:space="0" w:color="666666"/>
+                    <w:left w:val="none" w:sz="0" w:space="0" w:color="000000"/>
+                    <w:right w:val="none" w:sz="0" w:space="0" w:color="000000"/>
+                  </w:tcBorders>
+                  <w:shd w:val="clear" w:color="auto" w:fill="FFFFFF"/>
+                  <w:tcMar>
+                    <w:top w:w="0" w:type="dxa"/>
+                    <w:bottom w:w="0" w:type="dxa"/>
+                    <w:left w:w="0" w:type="dxa"/>
+                    <w:right w:w="0" w:type="dxa"/>
+                  </w:tcMar>
+                  <w:vAlign w:val="center"/>
+                </w:tcPr>
+                <w:p>
+                  <w:pPr>
+                    <w:jc w:val="left"/>
+                    <w:pBdr>
+                      <w:bottom w:val="none" w:sz="0" w:space="0" w:color="000000"/>
+                      <w:top w:val="none" w:sz="0" w:space="0" w:color="000000"/>
+                      <w:left w:val="none" w:sz="0" w:space="0" w:color="000000"/>
+                      <w:right w:val="none" w:sz="0" w:space="0" w:color="000000"/>
+                    </w:pBdr>
+                    <w:spacing w:after="60" w:before="60" w:line="240"/>
+                    <w:ind w:left="60" w:right="60" w:firstLine="0" w:firstLineChars="0"/>
+                    <w:rPr>
+                      <w:rFonts w:ascii="Arial" w:hAnsi="Helvetica" w:eastAsia="Helvetica" w:cs="Helvetica"/>
+                      <w:i w:val="false"/>
+                      <w:b w:val="false"/>
+                      <w:u w:val="none"/>
+                      <w:strike w:val="false"/>
+                      <w:sz w:val="16"/>
+                      <w:szCs w:val="16"/>
+                      <w:color w:val="000000"/>
+                    </w:rPr>
+                  </w:pPr>
+                  <w:r xmlns:w="http://schemas.openxmlformats.org/wordprocessingml/2006/main" xmlns:wp="http://schemas.openxmlformats.org/drawingml/2006/wordprocessingDrawing" xmlns:r="http://schemas.openxmlformats.org/officeDocument/2006/relationships" xmlns:w14="http://schemas.microsoft.com/office/word/2010/wordml">
+                    <w:rPr>
+                      <w:rFonts w:ascii="Arial" w:hAnsi="Helvetica" w:eastAsia="Helvetica" w:cs="Helvetica"/>
+                      <w:i w:val="false"/>
+                      <w:b w:val="false"/>
+                      <w:u w:val="none"/>
+                      <w:strike w:val="false"/>
+                      <w:sz w:val="16"/>
+                      <w:szCs w:val="16"/>
+                      <w:color w:val="000000"/>
+                    </w:rPr>
+                    <w:t xml:space="preserve">Comisión Económica para América Latina y el Caribe</w:t>
                   </w:r>
                 </w:p>
               </w:tc>
@@ -10012,7 +10714,7 @@
                       <w:szCs w:val="16"/>
                       <w:color w:val="000000"/>
                     </w:rPr>
-                    <w:t xml:space="preserve">IPCC</w:t>
+                    <w:t xml:space="preserve">EDGAR</w:t>
                   </w:r>
                 </w:p>
               </w:tc>
@@ -10066,7 +10768,7 @@
                       <w:szCs w:val="16"/>
                       <w:color w:val="000000"/>
                     </w:rPr>
-                    <w:t xml:space="preserve">Grupo Intergubernamental de Expertos sobre el Cambio Climático</w:t>
+                    <w:t xml:space="preserve">Base de datos de emisiones para la investigación atmosférica global (Emissions Database for Global Atmospheric Research)</w:t>
                   </w:r>
                 </w:p>
               </w:tc>
@@ -10125,7 +10827,7 @@
                       <w:szCs w:val="16"/>
                       <w:color w:val="000000"/>
                     </w:rPr>
-                    <w:t xml:space="preserve">ITBMS</w:t>
+                    <w:t xml:space="preserve">GIZ</w:t>
                   </w:r>
                 </w:p>
               </w:tc>
@@ -10179,7 +10881,7 @@
                       <w:szCs w:val="16"/>
                       <w:color w:val="000000"/>
                     </w:rPr>
-                    <w:t xml:space="preserve">Impuesto de transferencia de bienes corporales muebles y la prestación de servicios</w:t>
+                    <w:t xml:space="preserve">Agencia Alemana de Cooperación Internacional</w:t>
                   </w:r>
                 </w:p>
               </w:tc>
@@ -10238,7 +10940,7 @@
                       <w:szCs w:val="16"/>
                       <w:color w:val="000000"/>
                     </w:rPr>
-                    <w:t xml:space="preserve">MEF</w:t>
+                    <w:t xml:space="preserve">IED</w:t>
                   </w:r>
                 </w:p>
               </w:tc>
@@ -10292,7 +10994,7 @@
                       <w:szCs w:val="16"/>
                       <w:color w:val="000000"/>
                     </w:rPr>
-                    <w:t xml:space="preserve">Ministerio de Economía y Finanzas</w:t>
+                    <w:t xml:space="preserve">Inversión extranjera directa</w:t>
                   </w:r>
                 </w:p>
               </w:tc>
@@ -10351,7 +11053,7 @@
                       <w:szCs w:val="16"/>
                       <w:color w:val="000000"/>
                     </w:rPr>
-                    <w:t xml:space="preserve">MiAMBIENTE</w:t>
+                    <w:t xml:space="preserve">INEC</w:t>
                   </w:r>
                 </w:p>
               </w:tc>
@@ -10405,7 +11107,7 @@
                       <w:szCs w:val="16"/>
                       <w:color w:val="000000"/>
                     </w:rPr>
-                    <w:t xml:space="preserve">Ministerio de Ambiente de Panamá</w:t>
+                    <w:t xml:space="preserve">Instituto Nacional de Estadística y Censo</w:t>
                   </w:r>
                 </w:p>
               </w:tc>
@@ -10464,7 +11166,7 @@
                       <w:szCs w:val="16"/>
                       <w:color w:val="000000"/>
                     </w:rPr>
-                    <w:t xml:space="preserve">PNUD</w:t>
+                    <w:t xml:space="preserve">IPCC</w:t>
                   </w:r>
                 </w:p>
               </w:tc>
@@ -10518,7 +11220,7 @@
                       <w:szCs w:val="16"/>
                       <w:color w:val="000000"/>
                     </w:rPr>
-                    <w:t xml:space="preserve">Programa de las Naciones Unidas para el Desarrollo</w:t>
+                    <w:t xml:space="preserve">Grupo Intergubernamental de Expertos sobre el Cambio Climático</w:t>
                   </w:r>
                 </w:p>
               </w:tc>
@@ -10530,6 +11232,458 @@
               <w:tc>
                 <w:tcPr>
                   <w:tcBorders>
+                    <w:bottom w:val="none" w:sz="0" w:space="0" w:color="000000"/>
+                    <w:top w:val="none" w:sz="0" w:space="0" w:color="000000"/>
+                    <w:left w:val="none" w:sz="0" w:space="0" w:color="000000"/>
+                    <w:right w:val="none" w:sz="0" w:space="0" w:color="000000"/>
+                  </w:tcBorders>
+                  <w:shd w:val="clear" w:color="auto" w:fill="FFFFFF"/>
+                  <w:tcMar>
+                    <w:top w:w="0" w:type="dxa"/>
+                    <w:bottom w:w="0" w:type="dxa"/>
+                    <w:left w:w="0" w:type="dxa"/>
+                    <w:right w:w="0" w:type="dxa"/>
+                  </w:tcMar>
+                  <w:vAlign w:val="center"/>
+                </w:tcPr>
+                <w:p>
+                  <w:pPr>
+                    <w:jc w:val="left"/>
+                    <w:pBdr>
+                      <w:bottom w:val="none" w:sz="0" w:space="0" w:color="000000"/>
+                      <w:top w:val="none" w:sz="0" w:space="0" w:color="000000"/>
+                      <w:left w:val="none" w:sz="0" w:space="0" w:color="000000"/>
+                      <w:right w:val="none" w:sz="0" w:space="0" w:color="000000"/>
+                    </w:pBdr>
+                    <w:spacing w:after="60" w:before="60" w:line="240"/>
+                    <w:ind w:left="60" w:right="60" w:firstLine="0" w:firstLineChars="0"/>
+                    <w:rPr>
+                      <w:rFonts w:ascii="Arial" w:hAnsi="Helvetica" w:eastAsia="Helvetica" w:cs="Helvetica"/>
+                      <w:i w:val="false"/>
+                      <w:b w:val="false"/>
+                      <w:u w:val="none"/>
+                      <w:strike w:val="false"/>
+                      <w:sz w:val="16"/>
+                      <w:szCs w:val="16"/>
+                      <w:color w:val="000000"/>
+                    </w:rPr>
+                  </w:pPr>
+                  <w:r xmlns:w="http://schemas.openxmlformats.org/wordprocessingml/2006/main" xmlns:wp="http://schemas.openxmlformats.org/drawingml/2006/wordprocessingDrawing" xmlns:r="http://schemas.openxmlformats.org/officeDocument/2006/relationships" xmlns:w14="http://schemas.microsoft.com/office/word/2010/wordml">
+                    <w:rPr>
+                      <w:rFonts w:ascii="Arial" w:hAnsi="Helvetica" w:eastAsia="Helvetica" w:cs="Helvetica"/>
+                      <w:i w:val="false"/>
+                      <w:b w:val="false"/>
+                      <w:u w:val="none"/>
+                      <w:strike w:val="false"/>
+                      <w:sz w:val="16"/>
+                      <w:szCs w:val="16"/>
+                      <w:color w:val="000000"/>
+                    </w:rPr>
+                    <w:t xml:space="preserve">ITBMS</w:t>
+                  </w:r>
+                </w:p>
+              </w:tc>
+              <w:tc>
+                <w:tcPr>
+                  <w:tcBorders>
+                    <w:bottom w:val="none" w:sz="0" w:space="0" w:color="000000"/>
+                    <w:top w:val="none" w:sz="0" w:space="0" w:color="000000"/>
+                    <w:left w:val="none" w:sz="0" w:space="0" w:color="000000"/>
+                    <w:right w:val="none" w:sz="0" w:space="0" w:color="000000"/>
+                  </w:tcBorders>
+                  <w:shd w:val="clear" w:color="auto" w:fill="FFFFFF"/>
+                  <w:tcMar>
+                    <w:top w:w="0" w:type="dxa"/>
+                    <w:bottom w:w="0" w:type="dxa"/>
+                    <w:left w:w="0" w:type="dxa"/>
+                    <w:right w:w="0" w:type="dxa"/>
+                  </w:tcMar>
+                  <w:vAlign w:val="center"/>
+                </w:tcPr>
+                <w:p>
+                  <w:pPr>
+                    <w:jc w:val="left"/>
+                    <w:pBdr>
+                      <w:bottom w:val="none" w:sz="0" w:space="0" w:color="000000"/>
+                      <w:top w:val="none" w:sz="0" w:space="0" w:color="000000"/>
+                      <w:left w:val="none" w:sz="0" w:space="0" w:color="000000"/>
+                      <w:right w:val="none" w:sz="0" w:space="0" w:color="000000"/>
+                    </w:pBdr>
+                    <w:spacing w:after="60" w:before="60" w:line="240"/>
+                    <w:ind w:left="60" w:right="60" w:firstLine="0" w:firstLineChars="0"/>
+                    <w:rPr>
+                      <w:rFonts w:ascii="Arial" w:hAnsi="Helvetica" w:eastAsia="Helvetica" w:cs="Helvetica"/>
+                      <w:i w:val="false"/>
+                      <w:b w:val="false"/>
+                      <w:u w:val="none"/>
+                      <w:strike w:val="false"/>
+                      <w:sz w:val="16"/>
+                      <w:szCs w:val="16"/>
+                      <w:color w:val="000000"/>
+                    </w:rPr>
+                  </w:pPr>
+                  <w:r xmlns:w="http://schemas.openxmlformats.org/wordprocessingml/2006/main" xmlns:wp="http://schemas.openxmlformats.org/drawingml/2006/wordprocessingDrawing" xmlns:r="http://schemas.openxmlformats.org/officeDocument/2006/relationships" xmlns:w14="http://schemas.microsoft.com/office/word/2010/wordml">
+                    <w:rPr>
+                      <w:rFonts w:ascii="Arial" w:hAnsi="Helvetica" w:eastAsia="Helvetica" w:cs="Helvetica"/>
+                      <w:i w:val="false"/>
+                      <w:b w:val="false"/>
+                      <w:u w:val="none"/>
+                      <w:strike w:val="false"/>
+                      <w:sz w:val="16"/>
+                      <w:szCs w:val="16"/>
+                      <w:color w:val="000000"/>
+                    </w:rPr>
+                    <w:t xml:space="preserve">Impuesto de transferencia de bienes corporales muebles y la prestación de servicios</w:t>
+                  </w:r>
+                </w:p>
+              </w:tc>
+            </w:tr>
+            <w:tr>
+              <w:trPr>
+                <w:trHeight w:val="360" w:hRule="auto"/>
+              </w:trPr>
+              <w:tc>
+                <w:tcPr>
+                  <w:tcBorders>
+                    <w:bottom w:val="none" w:sz="0" w:space="0" w:color="000000"/>
+                    <w:top w:val="none" w:sz="0" w:space="0" w:color="000000"/>
+                    <w:left w:val="none" w:sz="0" w:space="0" w:color="000000"/>
+                    <w:right w:val="none" w:sz="0" w:space="0" w:color="000000"/>
+                  </w:tcBorders>
+                  <w:shd w:val="clear" w:color="auto" w:fill="FFFFFF"/>
+                  <w:tcMar>
+                    <w:top w:w="0" w:type="dxa"/>
+                    <w:bottom w:w="0" w:type="dxa"/>
+                    <w:left w:w="0" w:type="dxa"/>
+                    <w:right w:w="0" w:type="dxa"/>
+                  </w:tcMar>
+                  <w:vAlign w:val="center"/>
+                </w:tcPr>
+                <w:p>
+                  <w:pPr>
+                    <w:jc w:val="left"/>
+                    <w:pBdr>
+                      <w:bottom w:val="none" w:sz="0" w:space="0" w:color="000000"/>
+                      <w:top w:val="none" w:sz="0" w:space="0" w:color="000000"/>
+                      <w:left w:val="none" w:sz="0" w:space="0" w:color="000000"/>
+                      <w:right w:val="none" w:sz="0" w:space="0" w:color="000000"/>
+                    </w:pBdr>
+                    <w:spacing w:after="60" w:before="60" w:line="240"/>
+                    <w:ind w:left="60" w:right="60" w:firstLine="0" w:firstLineChars="0"/>
+                    <w:rPr>
+                      <w:rFonts w:ascii="Arial" w:hAnsi="Helvetica" w:eastAsia="Helvetica" w:cs="Helvetica"/>
+                      <w:i w:val="false"/>
+                      <w:b w:val="false"/>
+                      <w:u w:val="none"/>
+                      <w:strike w:val="false"/>
+                      <w:sz w:val="16"/>
+                      <w:szCs w:val="16"/>
+                      <w:color w:val="000000"/>
+                    </w:rPr>
+                  </w:pPr>
+                  <w:r xmlns:w="http://schemas.openxmlformats.org/wordprocessingml/2006/main" xmlns:wp="http://schemas.openxmlformats.org/drawingml/2006/wordprocessingDrawing" xmlns:r="http://schemas.openxmlformats.org/officeDocument/2006/relationships" xmlns:w14="http://schemas.microsoft.com/office/word/2010/wordml">
+                    <w:rPr>
+                      <w:rFonts w:ascii="Arial" w:hAnsi="Helvetica" w:eastAsia="Helvetica" w:cs="Helvetica"/>
+                      <w:i w:val="false"/>
+                      <w:b w:val="false"/>
+                      <w:u w:val="none"/>
+                      <w:strike w:val="false"/>
+                      <w:sz w:val="16"/>
+                      <w:szCs w:val="16"/>
+                      <w:color w:val="000000"/>
+                    </w:rPr>
+                    <w:t xml:space="preserve">MEF</w:t>
+                  </w:r>
+                </w:p>
+              </w:tc>
+              <w:tc>
+                <w:tcPr>
+                  <w:tcBorders>
+                    <w:bottom w:val="none" w:sz="0" w:space="0" w:color="000000"/>
+                    <w:top w:val="none" w:sz="0" w:space="0" w:color="000000"/>
+                    <w:left w:val="none" w:sz="0" w:space="0" w:color="000000"/>
+                    <w:right w:val="none" w:sz="0" w:space="0" w:color="000000"/>
+                  </w:tcBorders>
+                  <w:shd w:val="clear" w:color="auto" w:fill="FFFFFF"/>
+                  <w:tcMar>
+                    <w:top w:w="0" w:type="dxa"/>
+                    <w:bottom w:w="0" w:type="dxa"/>
+                    <w:left w:w="0" w:type="dxa"/>
+                    <w:right w:w="0" w:type="dxa"/>
+                  </w:tcMar>
+                  <w:vAlign w:val="center"/>
+                </w:tcPr>
+                <w:p>
+                  <w:pPr>
+                    <w:jc w:val="left"/>
+                    <w:pBdr>
+                      <w:bottom w:val="none" w:sz="0" w:space="0" w:color="000000"/>
+                      <w:top w:val="none" w:sz="0" w:space="0" w:color="000000"/>
+                      <w:left w:val="none" w:sz="0" w:space="0" w:color="000000"/>
+                      <w:right w:val="none" w:sz="0" w:space="0" w:color="000000"/>
+                    </w:pBdr>
+                    <w:spacing w:after="60" w:before="60" w:line="240"/>
+                    <w:ind w:left="60" w:right="60" w:firstLine="0" w:firstLineChars="0"/>
+                    <w:rPr>
+                      <w:rFonts w:ascii="Arial" w:hAnsi="Helvetica" w:eastAsia="Helvetica" w:cs="Helvetica"/>
+                      <w:i w:val="false"/>
+                      <w:b w:val="false"/>
+                      <w:u w:val="none"/>
+                      <w:strike w:val="false"/>
+                      <w:sz w:val="16"/>
+                      <w:szCs w:val="16"/>
+                      <w:color w:val="000000"/>
+                    </w:rPr>
+                  </w:pPr>
+                  <w:r xmlns:w="http://schemas.openxmlformats.org/wordprocessingml/2006/main" xmlns:wp="http://schemas.openxmlformats.org/drawingml/2006/wordprocessingDrawing" xmlns:r="http://schemas.openxmlformats.org/officeDocument/2006/relationships" xmlns:w14="http://schemas.microsoft.com/office/word/2010/wordml">
+                    <w:rPr>
+                      <w:rFonts w:ascii="Arial" w:hAnsi="Helvetica" w:eastAsia="Helvetica" w:cs="Helvetica"/>
+                      <w:i w:val="false"/>
+                      <w:b w:val="false"/>
+                      <w:u w:val="none"/>
+                      <w:strike w:val="false"/>
+                      <w:sz w:val="16"/>
+                      <w:szCs w:val="16"/>
+                      <w:color w:val="000000"/>
+                    </w:rPr>
+                    <w:t xml:space="preserve">Ministerio de Economía y Finanzas</w:t>
+                  </w:r>
+                </w:p>
+              </w:tc>
+            </w:tr>
+            <w:tr>
+              <w:trPr>
+                <w:trHeight w:val="360" w:hRule="auto"/>
+              </w:trPr>
+              <w:tc>
+                <w:tcPr>
+                  <w:tcBorders>
+                    <w:bottom w:val="none" w:sz="0" w:space="0" w:color="000000"/>
+                    <w:top w:val="none" w:sz="0" w:space="0" w:color="000000"/>
+                    <w:left w:val="none" w:sz="0" w:space="0" w:color="000000"/>
+                    <w:right w:val="none" w:sz="0" w:space="0" w:color="000000"/>
+                  </w:tcBorders>
+                  <w:shd w:val="clear" w:color="auto" w:fill="FFFFFF"/>
+                  <w:tcMar>
+                    <w:top w:w="0" w:type="dxa"/>
+                    <w:bottom w:w="0" w:type="dxa"/>
+                    <w:left w:w="0" w:type="dxa"/>
+                    <w:right w:w="0" w:type="dxa"/>
+                  </w:tcMar>
+                  <w:vAlign w:val="center"/>
+                </w:tcPr>
+                <w:p>
+                  <w:pPr>
+                    <w:jc w:val="left"/>
+                    <w:pBdr>
+                      <w:bottom w:val="none" w:sz="0" w:space="0" w:color="000000"/>
+                      <w:top w:val="none" w:sz="0" w:space="0" w:color="000000"/>
+                      <w:left w:val="none" w:sz="0" w:space="0" w:color="000000"/>
+                      <w:right w:val="none" w:sz="0" w:space="0" w:color="000000"/>
+                    </w:pBdr>
+                    <w:spacing w:after="60" w:before="60" w:line="240"/>
+                    <w:ind w:left="60" w:right="60" w:firstLine="0" w:firstLineChars="0"/>
+                    <w:rPr>
+                      <w:rFonts w:ascii="Arial" w:hAnsi="Helvetica" w:eastAsia="Helvetica" w:cs="Helvetica"/>
+                      <w:i w:val="false"/>
+                      <w:b w:val="false"/>
+                      <w:u w:val="none"/>
+                      <w:strike w:val="false"/>
+                      <w:sz w:val="16"/>
+                      <w:szCs w:val="16"/>
+                      <w:color w:val="000000"/>
+                    </w:rPr>
+                  </w:pPr>
+                  <w:r xmlns:w="http://schemas.openxmlformats.org/wordprocessingml/2006/main" xmlns:wp="http://schemas.openxmlformats.org/drawingml/2006/wordprocessingDrawing" xmlns:r="http://schemas.openxmlformats.org/officeDocument/2006/relationships" xmlns:w14="http://schemas.microsoft.com/office/word/2010/wordml">
+                    <w:rPr>
+                      <w:rFonts w:ascii="Arial" w:hAnsi="Helvetica" w:eastAsia="Helvetica" w:cs="Helvetica"/>
+                      <w:i w:val="false"/>
+                      <w:b w:val="false"/>
+                      <w:u w:val="none"/>
+                      <w:strike w:val="false"/>
+                      <w:sz w:val="16"/>
+                      <w:szCs w:val="16"/>
+                      <w:color w:val="000000"/>
+                    </w:rPr>
+                    <w:t xml:space="preserve">MiAMBIENTE</w:t>
+                  </w:r>
+                </w:p>
+              </w:tc>
+              <w:tc>
+                <w:tcPr>
+                  <w:tcBorders>
+                    <w:bottom w:val="none" w:sz="0" w:space="0" w:color="000000"/>
+                    <w:top w:val="none" w:sz="0" w:space="0" w:color="000000"/>
+                    <w:left w:val="none" w:sz="0" w:space="0" w:color="000000"/>
+                    <w:right w:val="none" w:sz="0" w:space="0" w:color="000000"/>
+                  </w:tcBorders>
+                  <w:shd w:val="clear" w:color="auto" w:fill="FFFFFF"/>
+                  <w:tcMar>
+                    <w:top w:w="0" w:type="dxa"/>
+                    <w:bottom w:w="0" w:type="dxa"/>
+                    <w:left w:w="0" w:type="dxa"/>
+                    <w:right w:w="0" w:type="dxa"/>
+                  </w:tcMar>
+                  <w:vAlign w:val="center"/>
+                </w:tcPr>
+                <w:p>
+                  <w:pPr>
+                    <w:jc w:val="left"/>
+                    <w:pBdr>
+                      <w:bottom w:val="none" w:sz="0" w:space="0" w:color="000000"/>
+                      <w:top w:val="none" w:sz="0" w:space="0" w:color="000000"/>
+                      <w:left w:val="none" w:sz="0" w:space="0" w:color="000000"/>
+                      <w:right w:val="none" w:sz="0" w:space="0" w:color="000000"/>
+                    </w:pBdr>
+                    <w:spacing w:after="60" w:before="60" w:line="240"/>
+                    <w:ind w:left="60" w:right="60" w:firstLine="0" w:firstLineChars="0"/>
+                    <w:rPr>
+                      <w:rFonts w:ascii="Arial" w:hAnsi="Helvetica" w:eastAsia="Helvetica" w:cs="Helvetica"/>
+                      <w:i w:val="false"/>
+                      <w:b w:val="false"/>
+                      <w:u w:val="none"/>
+                      <w:strike w:val="false"/>
+                      <w:sz w:val="16"/>
+                      <w:szCs w:val="16"/>
+                      <w:color w:val="000000"/>
+                    </w:rPr>
+                  </w:pPr>
+                  <w:r xmlns:w="http://schemas.openxmlformats.org/wordprocessingml/2006/main" xmlns:wp="http://schemas.openxmlformats.org/drawingml/2006/wordprocessingDrawing" xmlns:r="http://schemas.openxmlformats.org/officeDocument/2006/relationships" xmlns:w14="http://schemas.microsoft.com/office/word/2010/wordml">
+                    <w:rPr>
+                      <w:rFonts w:ascii="Arial" w:hAnsi="Helvetica" w:eastAsia="Helvetica" w:cs="Helvetica"/>
+                      <w:i w:val="false"/>
+                      <w:b w:val="false"/>
+                      <w:u w:val="none"/>
+                      <w:strike w:val="false"/>
+                      <w:sz w:val="16"/>
+                      <w:szCs w:val="16"/>
+                      <w:color w:val="000000"/>
+                    </w:rPr>
+                    <w:t xml:space="preserve">Ministerio de Ambiente de Panamá</w:t>
+                  </w:r>
+                </w:p>
+              </w:tc>
+            </w:tr>
+            <w:tr>
+              <w:trPr>
+                <w:trHeight w:val="360" w:hRule="auto"/>
+              </w:trPr>
+              <w:tc>
+                <w:tcPr>
+                  <w:tcBorders>
+                    <w:bottom w:val="none" w:sz="0" w:space="0" w:color="000000"/>
+                    <w:top w:val="none" w:sz="0" w:space="0" w:color="000000"/>
+                    <w:left w:val="none" w:sz="0" w:space="0" w:color="000000"/>
+                    <w:right w:val="none" w:sz="0" w:space="0" w:color="000000"/>
+                  </w:tcBorders>
+                  <w:shd w:val="clear" w:color="auto" w:fill="FFFFFF"/>
+                  <w:tcMar>
+                    <w:top w:w="0" w:type="dxa"/>
+                    <w:bottom w:w="0" w:type="dxa"/>
+                    <w:left w:w="0" w:type="dxa"/>
+                    <w:right w:w="0" w:type="dxa"/>
+                  </w:tcMar>
+                  <w:vAlign w:val="center"/>
+                </w:tcPr>
+                <w:p>
+                  <w:pPr>
+                    <w:jc w:val="left"/>
+                    <w:pBdr>
+                      <w:bottom w:val="none" w:sz="0" w:space="0" w:color="000000"/>
+                      <w:top w:val="none" w:sz="0" w:space="0" w:color="000000"/>
+                      <w:left w:val="none" w:sz="0" w:space="0" w:color="000000"/>
+                      <w:right w:val="none" w:sz="0" w:space="0" w:color="000000"/>
+                    </w:pBdr>
+                    <w:spacing w:after="60" w:before="60" w:line="240"/>
+                    <w:ind w:left="60" w:right="60" w:firstLine="0" w:firstLineChars="0"/>
+                    <w:rPr>
+                      <w:rFonts w:ascii="Arial" w:hAnsi="Helvetica" w:eastAsia="Helvetica" w:cs="Helvetica"/>
+                      <w:i w:val="false"/>
+                      <w:b w:val="false"/>
+                      <w:u w:val="none"/>
+                      <w:strike w:val="false"/>
+                      <w:sz w:val="16"/>
+                      <w:szCs w:val="16"/>
+                      <w:color w:val="000000"/>
+                    </w:rPr>
+                  </w:pPr>
+                  <w:r xmlns:w="http://schemas.openxmlformats.org/wordprocessingml/2006/main" xmlns:wp="http://schemas.openxmlformats.org/drawingml/2006/wordprocessingDrawing" xmlns:r="http://schemas.openxmlformats.org/officeDocument/2006/relationships" xmlns:w14="http://schemas.microsoft.com/office/word/2010/wordml">
+                    <w:rPr>
+                      <w:rFonts w:ascii="Arial" w:hAnsi="Helvetica" w:eastAsia="Helvetica" w:cs="Helvetica"/>
+                      <w:i w:val="false"/>
+                      <w:b w:val="false"/>
+                      <w:u w:val="none"/>
+                      <w:strike w:val="false"/>
+                      <w:sz w:val="16"/>
+                      <w:szCs w:val="16"/>
+                      <w:color w:val="000000"/>
+                    </w:rPr>
+                    <w:t xml:space="preserve">PNUD</w:t>
+                  </w:r>
+                </w:p>
+              </w:tc>
+              <w:tc>
+                <w:tcPr>
+                  <w:tcBorders>
+                    <w:bottom w:val="none" w:sz="0" w:space="0" w:color="000000"/>
+                    <w:top w:val="none" w:sz="0" w:space="0" w:color="000000"/>
+                    <w:left w:val="none" w:sz="0" w:space="0" w:color="000000"/>
+                    <w:right w:val="none" w:sz="0" w:space="0" w:color="000000"/>
+                  </w:tcBorders>
+                  <w:shd w:val="clear" w:color="auto" w:fill="FFFFFF"/>
+                  <w:tcMar>
+                    <w:top w:w="0" w:type="dxa"/>
+                    <w:bottom w:w="0" w:type="dxa"/>
+                    <w:left w:w="0" w:type="dxa"/>
+                    <w:right w:w="0" w:type="dxa"/>
+                  </w:tcMar>
+                  <w:vAlign w:val="center"/>
+                </w:tcPr>
+                <w:p>
+                  <w:pPr>
+                    <w:jc w:val="left"/>
+                    <w:pBdr>
+                      <w:bottom w:val="none" w:sz="0" w:space="0" w:color="000000"/>
+                      <w:top w:val="none" w:sz="0" w:space="0" w:color="000000"/>
+                      <w:left w:val="none" w:sz="0" w:space="0" w:color="000000"/>
+                      <w:right w:val="none" w:sz="0" w:space="0" w:color="000000"/>
+                    </w:pBdr>
+                    <w:spacing w:after="60" w:before="60" w:line="240"/>
+                    <w:ind w:left="60" w:right="60" w:firstLine="0" w:firstLineChars="0"/>
+                    <w:rPr>
+                      <w:rFonts w:ascii="Arial" w:hAnsi="Helvetica" w:eastAsia="Helvetica" w:cs="Helvetica"/>
+                      <w:i w:val="false"/>
+                      <w:b w:val="false"/>
+                      <w:u w:val="none"/>
+                      <w:strike w:val="false"/>
+                      <w:sz w:val="16"/>
+                      <w:szCs w:val="16"/>
+                      <w:color w:val="000000"/>
+                    </w:rPr>
+                  </w:pPr>
+                  <w:r xmlns:w="http://schemas.openxmlformats.org/wordprocessingml/2006/main" xmlns:wp="http://schemas.openxmlformats.org/drawingml/2006/wordprocessingDrawing" xmlns:r="http://schemas.openxmlformats.org/officeDocument/2006/relationships" xmlns:w14="http://schemas.microsoft.com/office/word/2010/wordml">
+                    <w:rPr>
+                      <w:rFonts w:ascii="Arial" w:hAnsi="Helvetica" w:eastAsia="Helvetica" w:cs="Helvetica"/>
+                      <w:i w:val="false"/>
+                      <w:b w:val="false"/>
+                      <w:u w:val="none"/>
+                      <w:strike w:val="false"/>
+                      <w:sz w:val="16"/>
+                      <w:szCs w:val="16"/>
+                      <w:color w:val="000000"/>
+                    </w:rPr>
+                    <w:t xml:space="preserve">Programa de las Naciones Unidas para el Desarrollo</w:t>
+                  </w:r>
+                </w:p>
+              </w:tc>
+            </w:tr>
+            <w:tr>
+              <w:trPr>
+                <w:trHeight w:val="360" w:hRule="auto"/>
+              </w:trPr>
+              <w:tc>
+                <w:tcPr>
+                  <w:tcBorders>
                     <w:bottom w:val="single" w:sz="12" w:space="0" w:color="666666"/>
                     <w:top w:val="none" w:sz="0" w:space="0" w:color="000000"/>
                     <w:left w:val="none" w:sz="0" w:space="0" w:color="000000"/>
@@ -10637,13 +11791,13 @@
               </w:tc>
             </w:tr>
           </w:tbl>
-          <w:bookmarkEnd w:id="64"/>
+          <w:bookmarkEnd w:id="69"/>
           <w:p/>
         </w:tc>
       </w:tr>
     </w:tbl>
-    <w:bookmarkEnd w:id="65"/>
-    <w:bookmarkStart w:id="103" w:name="referencias"/>
+    <w:bookmarkEnd w:id="70"/>
+    <w:bookmarkStart w:id="108" w:name="referencias"/>
     <w:p>
       <w:pPr>
         <w:pStyle w:val="Heading1"/>
@@ -10652,8 +11806,8 @@
         <w:t xml:space="preserve">Referencias</w:t>
       </w:r>
     </w:p>
-    <w:bookmarkStart w:id="102" w:name="refs"/>
-    <w:bookmarkStart w:id="67" w:name="ref-eea2023EconomicInstruments"/>
+    <w:bookmarkStart w:id="107" w:name="refs"/>
+    <w:bookmarkStart w:id="72" w:name="ref-eea2023EconomicInstruments"/>
     <w:p>
       <w:pPr>
         <w:pStyle w:val="Bibliography"/>
@@ -10680,7 +11834,7 @@
       <w:r>
         <w:t xml:space="preserve"> </w:t>
       </w:r>
-      <w:hyperlink r:id="rId66">
+      <w:hyperlink r:id="rId71">
         <w:r>
           <w:rPr>
             <w:rStyle w:val="Hyperlink"/>
@@ -10689,8 +11843,8 @@
         </w:r>
       </w:hyperlink>
     </w:p>
-    <w:bookmarkEnd w:id="67"/>
-    <w:bookmarkStart w:id="69" w:name="ref-panama2018Ley33"/>
+    <w:bookmarkEnd w:id="72"/>
+    <w:bookmarkStart w:id="74" w:name="ref-panama2018Ley33"/>
     <w:p>
       <w:pPr>
         <w:pStyle w:val="Bibliography"/>
@@ -10714,7 +11868,7 @@
       <w:r>
         <w:t xml:space="preserve"> </w:t>
       </w:r>
-      <w:hyperlink r:id="rId68">
+      <w:hyperlink r:id="rId73">
         <w:r>
           <w:rPr>
             <w:rStyle w:val="Hyperlink"/>
@@ -10723,8 +11877,8 @@
         </w:r>
       </w:hyperlink>
     </w:p>
-    <w:bookmarkEnd w:id="69"/>
-    <w:bookmarkStart w:id="71" w:name="ref-panama2020Ley187"/>
+    <w:bookmarkEnd w:id="74"/>
+    <w:bookmarkStart w:id="76" w:name="ref-panama2020Ley187"/>
     <w:p>
       <w:pPr>
         <w:pStyle w:val="Bibliography"/>
@@ -10748,7 +11902,7 @@
       <w:r>
         <w:t xml:space="preserve"> </w:t>
       </w:r>
-      <w:hyperlink r:id="rId70">
+      <w:hyperlink r:id="rId75">
         <w:r>
           <w:rPr>
             <w:rStyle w:val="Hyperlink"/>
@@ -10757,8 +11911,8 @@
         </w:r>
       </w:hyperlink>
     </w:p>
-    <w:bookmarkEnd w:id="71"/>
-    <w:bookmarkStart w:id="73" w:name="ref-panama2025Ley502"/>
+    <w:bookmarkEnd w:id="76"/>
+    <w:bookmarkStart w:id="78" w:name="ref-panama2025Ley502"/>
     <w:p>
       <w:pPr>
         <w:pStyle w:val="Bibliography"/>
@@ -10782,7 +11936,7 @@
       <w:r>
         <w:t xml:space="preserve"> </w:t>
       </w:r>
-      <w:hyperlink r:id="rId72">
+      <w:hyperlink r:id="rId77">
         <w:r>
           <w:rPr>
             <w:rStyle w:val="Hyperlink"/>
@@ -10791,8 +11945,8 @@
         </w:r>
       </w:hyperlink>
     </w:p>
-    <w:bookmarkEnd w:id="73"/>
-    <w:bookmarkStart w:id="75" w:name="ref-aaud2017PNGIR"/>
+    <w:bookmarkEnd w:id="78"/>
+    <w:bookmarkStart w:id="80" w:name="ref-aaud2017PNGIR"/>
     <w:p>
       <w:pPr>
         <w:pStyle w:val="Bibliography"/>
@@ -10816,7 +11970,7 @@
       <w:r>
         <w:t xml:space="preserve"> </w:t>
       </w:r>
-      <w:hyperlink r:id="rId74">
+      <w:hyperlink r:id="rId79">
         <w:r>
           <w:rPr>
             <w:rStyle w:val="Hyperlink"/>
@@ -10825,8 +11979,8 @@
         </w:r>
       </w:hyperlink>
     </w:p>
-    <w:bookmarkEnd w:id="75"/>
-    <w:bookmarkStart w:id="76" w:name="ref-giz2026InstrumentosFinancieros"/>
+    <w:bookmarkEnd w:id="80"/>
+    <w:bookmarkStart w:id="81" w:name="ref-giz2026InstrumentosFinancieros"/>
     <w:p>
       <w:pPr>
         <w:pStyle w:val="Bibliography"/>
@@ -10880,8 +12034,8 @@
         <w:t xml:space="preserve">cnico CEPAL, 21 de agosto de 2026.</w:t>
       </w:r>
     </w:p>
-    <w:bookmarkEnd w:id="76"/>
-    <w:bookmarkStart w:id="78" w:name="ref-inec2024mip"/>
+    <w:bookmarkEnd w:id="81"/>
+    <w:bookmarkStart w:id="83" w:name="ref-inec2024mip"/>
     <w:p>
       <w:pPr>
         <w:pStyle w:val="Bibliography"/>
@@ -10905,7 +12059,7 @@
       <w:r>
         <w:t xml:space="preserve"> </w:t>
       </w:r>
-      <w:hyperlink r:id="rId77">
+      <w:hyperlink r:id="rId82">
         <w:r>
           <w:rPr>
             <w:rStyle w:val="Hyperlink"/>
@@ -10914,8 +12068,8 @@
         </w:r>
       </w:hyperlink>
     </w:p>
-    <w:bookmarkEnd w:id="78"/>
-    <w:bookmarkStart w:id="79" w:name="ref-inec2026cou"/>
+    <w:bookmarkEnd w:id="83"/>
+    <w:bookmarkStart w:id="84" w:name="ref-inec2026cou"/>
     <w:p>
       <w:pPr>
         <w:pStyle w:val="Bibliography"/>
@@ -10939,7 +12093,7 @@
       <w:r>
         <w:t xml:space="preserve"> </w:t>
       </w:r>
-      <w:hyperlink r:id="rId77">
+      <w:hyperlink r:id="rId82">
         <w:r>
           <w:rPr>
             <w:rStyle w:val="Hyperlink"/>
@@ -10948,8 +12102,8 @@
         </w:r>
       </w:hyperlink>
     </w:p>
-    <w:bookmarkEnd w:id="79"/>
-    <w:bookmarkStart w:id="81" w:name="ref-millerblair2022"/>
+    <w:bookmarkEnd w:id="84"/>
+    <w:bookmarkStart w:id="86" w:name="ref-millerblair2022"/>
     <w:p>
       <w:pPr>
         <w:pStyle w:val="Bibliography"/>
@@ -10976,7 +12130,7 @@
       <w:r>
         <w:t xml:space="preserve"> </w:t>
       </w:r>
-      <w:hyperlink r:id="rId80">
+      <w:hyperlink r:id="rId85">
         <w:r>
           <w:rPr>
             <w:rStyle w:val="Hyperlink"/>
@@ -10985,8 +12139,8 @@
         </w:r>
       </w:hyperlink>
     </w:p>
-    <w:bookmarkEnd w:id="81"/>
-    <w:bookmarkStart w:id="83" w:name="ref-miambiente2024HojaRutaEC"/>
+    <w:bookmarkEnd w:id="86"/>
+    <w:bookmarkStart w:id="88" w:name="ref-miambiente2024HojaRutaEC"/>
     <w:p>
       <w:pPr>
         <w:pStyle w:val="Bibliography"/>
@@ -11010,7 +12164,7 @@
       <w:r>
         <w:t xml:space="preserve"> </w:t>
       </w:r>
-      <w:hyperlink r:id="rId82">
+      <w:hyperlink r:id="rId87">
         <w:r>
           <w:rPr>
             <w:rStyle w:val="Hyperlink"/>
@@ -11019,8 +12173,8 @@
         </w:r>
       </w:hyperlink>
     </w:p>
-    <w:bookmarkEnd w:id="83"/>
-    <w:bookmarkStart w:id="85" w:name="ref-minambienteCo2018Res1407"/>
+    <w:bookmarkEnd w:id="88"/>
+    <w:bookmarkStart w:id="90" w:name="ref-minambienteCo2018Res1407"/>
     <w:p>
       <w:pPr>
         <w:pStyle w:val="Bibliography"/>
@@ -11044,7 +12198,7 @@
       <w:r>
         <w:t xml:space="preserve"> </w:t>
       </w:r>
-      <w:hyperlink r:id="rId84">
+      <w:hyperlink r:id="rId89">
         <w:r>
           <w:rPr>
             <w:rStyle w:val="Hyperlink"/>
@@ -11053,8 +12207,8 @@
         </w:r>
       </w:hyperlink>
     </w:p>
-    <w:bookmarkEnd w:id="85"/>
-    <w:bookmarkStart w:id="87" w:name="ref-mef2024MarcoFinanciamientoSostenible"/>
+    <w:bookmarkEnd w:id="90"/>
+    <w:bookmarkStart w:id="92" w:name="ref-mef2024MarcoFinanciamientoSostenible"/>
     <w:p>
       <w:pPr>
         <w:pStyle w:val="Bibliography"/>
@@ -11106,7 +12260,7 @@
       <w:r>
         <w:t xml:space="preserve"> </w:t>
       </w:r>
-      <w:hyperlink r:id="rId86">
+      <w:hyperlink r:id="rId91">
         <w:r>
           <w:rPr>
             <w:rStyle w:val="Hyperlink"/>
@@ -11115,8 +12269,8 @@
         </w:r>
       </w:hyperlink>
     </w:p>
-    <w:bookmarkEnd w:id="87"/>
-    <w:bookmarkStart w:id="89" w:name="ref-chile2016Ley20920"/>
+    <w:bookmarkEnd w:id="92"/>
+    <w:bookmarkStart w:id="94" w:name="ref-chile2016Ley20920"/>
     <w:p>
       <w:pPr>
         <w:pStyle w:val="Bibliography"/>
@@ -11140,7 +12294,7 @@
       <w:r>
         <w:t xml:space="preserve"> </w:t>
       </w:r>
-      <w:hyperlink r:id="rId88">
+      <w:hyperlink r:id="rId93">
         <w:r>
           <w:rPr>
             <w:rStyle w:val="Hyperlink"/>
@@ -11149,8 +12303,8 @@
         </w:r>
       </w:hyperlink>
     </w:p>
-    <w:bookmarkEnd w:id="89"/>
-    <w:bookmarkStart w:id="91" w:name="ref-mmaChile2020DS12Envases"/>
+    <w:bookmarkEnd w:id="94"/>
+    <w:bookmarkStart w:id="96" w:name="ref-mmaChile2020DS12Envases"/>
     <w:p>
       <w:pPr>
         <w:pStyle w:val="Bibliography"/>
@@ -11174,7 +12328,7 @@
       <w:r>
         <w:t xml:space="preserve"> </w:t>
       </w:r>
-      <w:hyperlink r:id="rId90">
+      <w:hyperlink r:id="rId95">
         <w:r>
           <w:rPr>
             <w:rStyle w:val="Hyperlink"/>
@@ -11183,8 +12337,8 @@
         </w:r>
       </w:hyperlink>
     </w:p>
-    <w:bookmarkEnd w:id="91"/>
-    <w:bookmarkStart w:id="93" w:name="ref-ocde2016EPR"/>
+    <w:bookmarkEnd w:id="96"/>
+    <w:bookmarkStart w:id="98" w:name="ref-ocde2016EPR"/>
     <w:p>
       <w:pPr>
         <w:pStyle w:val="Bibliography"/>
@@ -11208,7 +12362,7 @@
       <w:r>
         <w:t xml:space="preserve"> </w:t>
       </w:r>
-      <w:hyperlink r:id="rId92">
+      <w:hyperlink r:id="rId97">
         <w:r>
           <w:rPr>
             <w:rStyle w:val="Hyperlink"/>
@@ -11217,8 +12371,8 @@
         </w:r>
       </w:hyperlink>
     </w:p>
-    <w:bookmarkEnd w:id="93"/>
-    <w:bookmarkStart w:id="95" w:name="ref-ue2018Directiva851"/>
+    <w:bookmarkEnd w:id="98"/>
+    <w:bookmarkStart w:id="100" w:name="ref-ue2018Directiva851"/>
     <w:p>
       <w:pPr>
         <w:pStyle w:val="Bibliography"/>
@@ -11242,7 +12396,7 @@
       <w:r>
         <w:t xml:space="preserve"> </w:t>
       </w:r>
-      <w:hyperlink r:id="rId94">
+      <w:hyperlink r:id="rId99">
         <w:r>
           <w:rPr>
             <w:rStyle w:val="Hyperlink"/>
@@ -11251,8 +12405,8 @@
         </w:r>
       </w:hyperlink>
     </w:p>
-    <w:bookmarkEnd w:id="95"/>
-    <w:bookmarkStart w:id="97" w:name="ref-peru2016DL1278"/>
+    <w:bookmarkEnd w:id="100"/>
+    <w:bookmarkStart w:id="102" w:name="ref-peru2016DL1278"/>
     <w:p>
       <w:pPr>
         <w:pStyle w:val="Bibliography"/>
@@ -11276,7 +12430,7 @@
       <w:r>
         <w:t xml:space="preserve"> </w:t>
       </w:r>
-      <w:hyperlink r:id="rId96">
+      <w:hyperlink r:id="rId101">
         <w:r>
           <w:rPr>
             <w:rStyle w:val="Hyperlink"/>
@@ -11285,8 +12439,8 @@
         </w:r>
       </w:hyperlink>
     </w:p>
-    <w:bookmarkEnd w:id="97"/>
-    <w:bookmarkStart w:id="99" w:name="ref-cepal2022HojasRuta"/>
+    <w:bookmarkEnd w:id="102"/>
+    <w:bookmarkStart w:id="104" w:name="ref-cepal2022HojasRuta"/>
     <w:p>
       <w:pPr>
         <w:pStyle w:val="Bibliography"/>
@@ -11359,7 +12513,7 @@
       <w:r>
         <w:t xml:space="preserve"> </w:t>
       </w:r>
-      <w:hyperlink r:id="rId98">
+      <w:hyperlink r:id="rId103">
         <w:r>
           <w:rPr>
             <w:rStyle w:val="Hyperlink"/>
@@ -11368,8 +12522,8 @@
         </w:r>
       </w:hyperlink>
     </w:p>
-    <w:bookmarkEnd w:id="99"/>
-    <w:bookmarkStart w:id="101" w:name="ref-sbp2024TaxonomiaPanama"/>
+    <w:bookmarkEnd w:id="104"/>
+    <w:bookmarkStart w:id="106" w:name="ref-sbp2024TaxonomiaPanama"/>
     <w:p>
       <w:pPr>
         <w:pStyle w:val="Bibliography"/>
@@ -11396,7 +12550,7 @@
       <w:r>
         <w:t xml:space="preserve"> </w:t>
       </w:r>
-      <w:hyperlink r:id="rId100">
+      <w:hyperlink r:id="rId105">
         <w:r>
           <w:rPr>
             <w:rStyle w:val="Hyperlink"/>
@@ -11405,9 +12559,9 @@
         </w:r>
       </w:hyperlink>
     </w:p>
-    <w:bookmarkEnd w:id="101"/>
-    <w:bookmarkEnd w:id="102"/>
-    <w:bookmarkEnd w:id="103"/>
+    <w:bookmarkEnd w:id="106"/>
+    <w:bookmarkEnd w:id="107"/>
+    <w:bookmarkEnd w:id="108"/>
     <w:sectPr>
       <w:footnotePr>
         <w:numRestart w:val="eachSect"/>

</xml_diff>